<commit_message>
Vendors: decisions, load plan with Ramp, bank detail comparison, remaining questions
Co-Authored-By: Claude Opus 5.5 <noreply@anthropic.com>
Claude-Session: https://claude.ai/code/session_01RcSpRnw5TDsnk5GdoeWT9P
</commit_message>
<xml_diff>
--- a/netsuite/dataload/vendors/output/vendor-load.docx
+++ b/netsuite/dataload/vendors/output/vendor-load.docx
@@ -315,7 +315,7 @@
                 <w:rFonts w:ascii="Arial" w:hAnsi="Arial"/>
                 <w:sz w:val="20"/>
               </w:rPr>
-              <w:t xml:space="preserve">Mapping drafted. Waiting on scope and the open questions below</w:t>
+              <w:t xml:space="preserve">Scope and rules agreed 2026-10-26. Load plan and remaining questions below</w:t>
             </w:r>
           </w:p>
         </w:tc>
@@ -551,7 +551,7 @@
                 <w:rFonts w:ascii="Arial" w:hAnsi="Arial"/>
                 <w:sz w:val="20"/>
               </w:rPr>
-              <w:t xml:space="preserve">Sage vendor ID. V-##### kept; older V##### (339) and Ramp-created RMP_# (37) get the next numbers after V-01768 [TBC: same rule as customers]</w:t>
+              <w:t xml:space="preserve">Sage vendor ID. V-##### kept; older V##### (339) and Ramp-created RMP_# (37) get the next numbers after V-01768, from V-01769. NetSuite auto-numbers new vendors after the last loaded number</w:t>
             </w:r>
           </w:p>
         </w:tc>
@@ -898,7 +898,7 @@
                 <w:rFonts w:ascii="Arial" w:hAnsi="Arial"/>
                 <w:sz w:val="20"/>
               </w:rPr>
-              <w:t xml:space="preserve">MinIO, Inc. [TBC: vendors with INR (9) or SGD (1) currency may belong to MinIO Pvt. Ltd. or MinIO Singapore Pte. Ltd.]</w:t>
+              <w:t xml:space="preserve">MinIO, Inc. [TBC: 9 INR vendors and 1 SGD vendor may belong to MinIO Pvt. Ltd. or MinIO Singapore Pte. Ltd.; see open questions]</w:t>
             </w:r>
           </w:p>
         </w:tc>
@@ -1674,7 +1674,7 @@
                 <w:rFonts w:ascii="Arial" w:hAnsi="Arial"/>
                 <w:sz w:val="20"/>
               </w:rPr>
-              <w:t xml:space="preserve">20100 Accounts Payable - Trade [TBC]</w:t>
+              <w:t xml:space="preserve">20100 Accounts Payable - Trade</w:t>
             </w:r>
           </w:p>
         </w:tc>
@@ -1796,7 +1796,7 @@
                 <w:rFonts w:ascii="Arial" w:hAnsi="Arial"/>
                 <w:sz w:val="20"/>
               </w:rPr>
-              <w:t xml:space="preserve">Sage tax ID (232), else Ramp TIN (140). Sensitive [TBC: load in this file or enter separately]</w:t>
+              <w:t xml:space="preserve">Sage tax ID (232), else Ramp TIN (140). In the load file; masked to the last 4 digits on review pages</w:t>
             </w:r>
           </w:p>
         </w:tc>
@@ -2233,7 +2233,7 @@
         <w:pStyle w:val="FirstParagraph"/>
       </w:pPr>
       <w:r>
-        <w:t xml:space="preserve">Not in the template, kept for review and for the record, as on the customer load: Question Categories, Duplicate Action, Ramp Vendor ID, Ramp Category, Owner, Department, Last activity (latest of Sage last bill, Sage last payment, Ramp last spend), Ramp 365-day spend, Flags.</w:t>
+        <w:t xml:space="preserve">Not in the template, kept as on the customer load. Source IDs, as custom fields: Sage Vendor ID (as in Sage, also in the template’s Legacy Vendor ID) and Ramp Vendor ID. For review only: Question Categories, Duplicate Action, Ramp Category, Owner, Department, Last activity (latest of Sage last bill, Sage last payment, Ramp last spend), Ramp 365-day spend, Flags.</w:t>
       </w:r>
     </w:p>
     <w:bookmarkEnd w:id="21"/>
@@ -3236,13 +3236,21 @@
       </w:r>
     </w:p>
     <w:bookmarkEnd w:id="23"/>
-    <w:bookmarkStart w:id="24" w:name="open-questions"/>
+    <w:bookmarkStart w:id="26" w:name="load-plan"/>
     <w:p>
       <w:pPr>
         <w:pStyle w:val="Heading1"/>
       </w:pPr>
       <w:r>
-        <w:t xml:space="preserve">Open questions</w:t>
+        <w:t xml:space="preserve">Load plan</w:t>
+      </w:r>
+    </w:p>
+    <w:p>
+      <w:pPr>
+        <w:pStyle w:val="FirstParagraph"/>
+      </w:pPr>
+      <w:r>
+        <w:t xml:space="preserve">Agreed 2026-10-26: every active Sage vendor ends up in NetSuite, with Ramp syncing its vendors.</w:t>
       </w:r>
     </w:p>
     <w:p>
@@ -3258,13 +3266,13 @@
           <w:bCs/>
           <w:b/>
         </w:rPr>
-        <w:t xml:space="preserve">Scope.</w:t>
+        <w:t xml:space="preserve">Ramp sync.</w:t>
       </w:r>
       <w:r>
         <w:t xml:space="preserve"> </w:t>
       </w:r>
       <w:r>
-        <w:t xml:space="preserve">Load all 1,770 active vendors as with customers, or only vendors with activity since 2024-10-26 (563) plus any with an open balance?</w:t>
+        <w:t xml:space="preserve">Ramp syncs its 578 vendors to NetSuite, including the 27 Ramp vendors not in Sage (added in Ramp from 2025-08 on, 23 with no spend yet).</w:t>
       </w:r>
     </w:p>
     <w:p>
@@ -3280,13 +3288,13 @@
           <w:bCs/>
           <w:b/>
         </w:rPr>
-        <w:t xml:space="preserve">Ramp as the vendor master.</w:t>
+        <w:t xml:space="preserve">Sage vendors not in Ramp.</w:t>
       </w:r>
       <w:r>
         <w:t xml:space="preserve"> </w:t>
       </w:r>
       <w:r>
-        <w:t xml:space="preserve">If Ramp syncs vendors to NetSuite, vendors paid through Ramp may be created by the sync. Does the load cover all vendors, or only those outside Ramp?</w:t>
+        <w:t xml:space="preserve">This load: the 1,219 active Sage vendors that are not in Ramp, mapped as above.</w:t>
       </w:r>
     </w:p>
     <w:p>
@@ -3302,20 +3310,717 @@
           <w:bCs/>
           <w:b/>
         </w:rPr>
-        <w:t xml:space="preserve">Credit card merchants.</w:t>
+        <w:t xml:space="preserve">Enrichment.</w:t>
       </w:r>
       <w:r>
         <w:t xml:space="preserve"> </w:t>
       </w:r>
       <w:r>
-        <w:t xml:space="preserve">427 vendors of type Credit Cards, 418 never billed. Load or leave out?</w:t>
+        <w:t xml:space="preserve">The 551 vendors in both systems get Sage values Ramp does not hold: Sage Vendor ID, Vendor Category, default expense account, 1099 flag, tax ID where Ramp has none, and bank details where Ramp has none.</w:t>
+      </w:r>
+    </w:p>
+    <w:bookmarkStart w:id="24" w:name="bank-details"/>
+    <w:p>
+      <w:pPr>
+        <w:pStyle w:val="Heading2"/>
+      </w:pPr>
+      <w:r>
+        <w:t xml:space="preserve">Bank details</w:t>
+      </w:r>
+    </w:p>
+    <w:tbl>
+      <w:tblPr>
+        <w:tblStyle w:val="Table"/>
+        <w:tblW w:type="dxa" w:w="9360"/>
+        <w:jc w:val="center"/>
+        <w:tblLook w:firstRow="1" w:lastRow="0" w:firstColumn="0" w:lastColumn="0" w:noHBand="0" w:noVBand="0" w:val="0020"/>
+        <w:tblBorders>
+          <w:top w:val="single" w:sz="4" w:space="0" w:color="BFC7D1"/>
+          <w:left w:val="single" w:sz="4" w:space="0" w:color="BFC7D1"/>
+          <w:bottom w:val="single" w:sz="4" w:space="0" w:color="BFC7D1"/>
+          <w:right w:val="single" w:sz="4" w:space="0" w:color="BFC7D1"/>
+          <w:insideH w:val="single" w:sz="4" w:space="0" w:color="BFC7D1"/>
+          <w:insideV w:val="single" w:sz="4" w:space="0" w:color="BFC7D1"/>
+        </w:tblBorders>
+        <w:tblLayout w:type="fixed"/>
+      </w:tblPr>
+      <w:tblGrid>
+        <w:gridCol w:w="4290"/>
+        <w:gridCol w:w="5070"/>
+      </w:tblGrid>
+      <w:tr>
+        <w:trPr>
+          <w:tblHeader w:val="true"/>
+        </w:trPr>
+        <w:tc>
+          <w:tcPr>
+            <w:tcW w:type="dxa" w:w="4290"/>
+            <w:shd w:val="clear" w:color="auto" w:fill="1F3B5C"/>
+          </w:tcPr>
+          <w:p>
+            <w:pPr>
+              <w:pStyle w:val="Compact"/>
+              <w:spacing w:before="40" w:after="40"/>
+            </w:pPr>
+          </w:p>
+        </w:tc>
+        <w:tc>
+          <w:tcPr>
+            <w:tcW w:type="dxa" w:w="5070"/>
+            <w:shd w:val="clear" w:color="auto" w:fill="1F3B5C"/>
+          </w:tcPr>
+          <w:p>
+            <w:pPr>
+              <w:pStyle w:val="Compact"/>
+              <w:spacing w:before="40" w:after="40"/>
+              <w:jc w:val="left"/>
+            </w:pPr>
+            <w:r>
+              <w:rPr>
+                <w:bCs/>
+                <w:rFonts w:ascii="Arial" w:hAnsi="Arial"/>
+                <w:b/>
+                <w:color w:val="FFFFFF"/>
+                <w:sz w:val="20"/>
+              </w:rPr>
+              <w:t xml:space="preserve">Vendors</w:t>
+            </w:r>
+          </w:p>
+        </w:tc>
+      </w:tr>
+      <w:tr>
+        <w:tc>
+          <w:tcPr>
+            <w:tcW w:type="dxa" w:w="4290"/>
+          </w:tcPr>
+          <w:p>
+            <w:pPr>
+              <w:pStyle w:val="Compact"/>
+              <w:spacing w:before="40" w:after="40"/>
+              <w:jc w:val="left"/>
+            </w:pPr>
+            <w:r>
+              <w:rPr>
+                <w:bCs/>
+                <w:rFonts w:ascii="Arial" w:hAnsi="Arial"/>
+                <w:b/>
+                <w:sz w:val="20"/>
+              </w:rPr>
+              <w:t xml:space="preserve">ACH details in Sage</w:t>
+            </w:r>
+          </w:p>
+        </w:tc>
+        <w:tc>
+          <w:tcPr>
+            <w:tcW w:type="dxa" w:w="5070"/>
+          </w:tcPr>
+          <w:p>
+            <w:pPr>
+              <w:pStyle w:val="Compact"/>
+              <w:spacing w:before="40" w:after="40"/>
+              <w:jc w:val="left"/>
+            </w:pPr>
+            <w:r>
+              <w:rPr>
+                <w:rFonts w:ascii="Arial" w:hAnsi="Arial"/>
+                <w:sz w:val="20"/>
+              </w:rPr>
+              <w:t xml:space="preserve">164</w:t>
+            </w:r>
+          </w:p>
+        </w:tc>
+      </w:tr>
+      <w:tr>
+        <w:tc>
+          <w:tcPr>
+            <w:tcW w:type="dxa" w:w="4290"/>
+          </w:tcPr>
+          <w:p>
+            <w:pPr>
+              <w:pStyle w:val="Compact"/>
+              <w:spacing w:before="40" w:after="40"/>
+              <w:jc w:val="left"/>
+            </w:pPr>
+            <w:r>
+              <w:rPr>
+                <w:bCs/>
+                <w:rFonts w:ascii="Arial" w:hAnsi="Arial"/>
+                <w:b/>
+                <w:sz w:val="20"/>
+              </w:rPr>
+              <w:t xml:space="preserve">ACH details in Ramp (vendors with a Sage ID)</w:t>
+            </w:r>
+          </w:p>
+        </w:tc>
+        <w:tc>
+          <w:tcPr>
+            <w:tcW w:type="dxa" w:w="5070"/>
+          </w:tcPr>
+          <w:p>
+            <w:pPr>
+              <w:pStyle w:val="Compact"/>
+              <w:spacing w:before="40" w:after="40"/>
+              <w:jc w:val="left"/>
+            </w:pPr>
+            <w:r>
+              <w:rPr>
+                <w:rFonts w:ascii="Arial" w:hAnsi="Arial"/>
+                <w:sz w:val="20"/>
+              </w:rPr>
+              <w:t xml:space="preserve">174</w:t>
+            </w:r>
+          </w:p>
+        </w:tc>
+      </w:tr>
+      <w:tr>
+        <w:tc>
+          <w:tcPr>
+            <w:tcW w:type="dxa" w:w="4290"/>
+          </w:tcPr>
+          <w:p>
+            <w:pPr>
+              <w:pStyle w:val="Compact"/>
+              <w:spacing w:before="40" w:after="40"/>
+              <w:jc w:val="left"/>
+            </w:pPr>
+            <w:r>
+              <w:rPr>
+                <w:bCs/>
+                <w:rFonts w:ascii="Arial" w:hAnsi="Arial"/>
+                <w:b/>
+                <w:sz w:val="20"/>
+              </w:rPr>
+              <w:t xml:space="preserve">In both</w:t>
+            </w:r>
+          </w:p>
+        </w:tc>
+        <w:tc>
+          <w:tcPr>
+            <w:tcW w:type="dxa" w:w="5070"/>
+          </w:tcPr>
+          <w:p>
+            <w:pPr>
+              <w:pStyle w:val="Compact"/>
+              <w:spacing w:before="40" w:after="40"/>
+              <w:jc w:val="left"/>
+            </w:pPr>
+            <w:r>
+              <w:rPr>
+                <w:rFonts w:ascii="Arial" w:hAnsi="Arial"/>
+                <w:sz w:val="20"/>
+              </w:rPr>
+              <w:t xml:space="preserve">70 (last 4 digits agree on 65, differ on 5)</w:t>
+            </w:r>
+          </w:p>
+        </w:tc>
+      </w:tr>
+      <w:tr>
+        <w:tc>
+          <w:tcPr>
+            <w:tcW w:type="dxa" w:w="4290"/>
+          </w:tcPr>
+          <w:p>
+            <w:pPr>
+              <w:pStyle w:val="Compact"/>
+              <w:spacing w:before="40" w:after="40"/>
+              <w:jc w:val="left"/>
+            </w:pPr>
+            <w:r>
+              <w:rPr>
+                <w:bCs/>
+                <w:rFonts w:ascii="Arial" w:hAnsi="Arial"/>
+                <w:b/>
+                <w:sz w:val="20"/>
+              </w:rPr>
+              <w:t xml:space="preserve">Sage only</w:t>
+            </w:r>
+          </w:p>
+        </w:tc>
+        <w:tc>
+          <w:tcPr>
+            <w:tcW w:type="dxa" w:w="5070"/>
+          </w:tcPr>
+          <w:p>
+            <w:pPr>
+              <w:pStyle w:val="Compact"/>
+              <w:spacing w:before="40" w:after="40"/>
+              <w:jc w:val="left"/>
+            </w:pPr>
+            <w:r>
+              <w:rPr>
+                <w:rFonts w:ascii="Arial" w:hAnsi="Arial"/>
+                <w:sz w:val="20"/>
+              </w:rPr>
+              <w:t xml:space="preserve">94 (13 in Ramp without bank details, 81 not in Ramp)</w:t>
+            </w:r>
+          </w:p>
+        </w:tc>
+      </w:tr>
+      <w:tr>
+        <w:tc>
+          <w:tcPr>
+            <w:tcW w:type="dxa" w:w="4290"/>
+          </w:tcPr>
+          <w:p>
+            <w:pPr>
+              <w:pStyle w:val="Compact"/>
+              <w:spacing w:before="40" w:after="40"/>
+              <w:jc w:val="left"/>
+            </w:pPr>
+            <w:r>
+              <w:rPr>
+                <w:bCs/>
+                <w:rFonts w:ascii="Arial" w:hAnsi="Arial"/>
+                <w:b/>
+                <w:sz w:val="20"/>
+              </w:rPr>
+              <w:t xml:space="preserve">Ramp only</w:t>
+            </w:r>
+          </w:p>
+        </w:tc>
+        <w:tc>
+          <w:tcPr>
+            <w:tcW w:type="dxa" w:w="5070"/>
+          </w:tcPr>
+          <w:p>
+            <w:pPr>
+              <w:pStyle w:val="Compact"/>
+              <w:spacing w:before="40" w:after="40"/>
+              <w:jc w:val="left"/>
+            </w:pPr>
+            <w:r>
+              <w:rPr>
+                <w:rFonts w:ascii="Arial" w:hAnsi="Arial"/>
+                <w:sz w:val="20"/>
+              </w:rPr>
+              <w:t xml:space="preserve">104</w:t>
+            </w:r>
+          </w:p>
+        </w:tc>
+      </w:tr>
+    </w:tbl>
+    <w:p>
+      <w:pPr>
+        <w:pStyle w:val="BodyText"/>
+      </w:pPr>
+      <w:r>
+        <w:t xml:space="preserve">Ramp’s details are the more recent where both exist. The vendor template has no bank fields, so bank details need their own NetSuite import (vendor bank details record), from Sage for the 94 and from Ramp for the rest if Ramp does not sync them.</w:t>
+      </w:r>
+    </w:p>
+    <w:bookmarkEnd w:id="24"/>
+    <w:bookmarkStart w:id="25" w:name="vendor-types-against-ramp"/>
+    <w:p>
+      <w:pPr>
+        <w:pStyle w:val="Heading2"/>
+      </w:pPr>
+      <w:r>
+        <w:t xml:space="preserve">Vendor types against Ramp</w:t>
+      </w:r>
+    </w:p>
+    <w:tbl>
+      <w:tblPr>
+        <w:tblStyle w:val="Table"/>
+        <w:tblW w:type="dxa" w:w="9360"/>
+        <w:jc w:val="center"/>
+        <w:tblLook w:firstRow="1" w:lastRow="0" w:firstColumn="0" w:lastColumn="0" w:noHBand="0" w:noVBand="0" w:val="0020"/>
+        <w:tblBorders>
+          <w:top w:val="single" w:sz="4" w:space="0" w:color="BFC7D1"/>
+          <w:left w:val="single" w:sz="4" w:space="0" w:color="BFC7D1"/>
+          <w:bottom w:val="single" w:sz="4" w:space="0" w:color="BFC7D1"/>
+          <w:right w:val="single" w:sz="4" w:space="0" w:color="BFC7D1"/>
+          <w:insideH w:val="single" w:sz="4" w:space="0" w:color="BFC7D1"/>
+          <w:insideV w:val="single" w:sz="4" w:space="0" w:color="BFC7D1"/>
+        </w:tblBorders>
+        <w:tblLayout w:type="fixed"/>
+      </w:tblPr>
+      <w:tblGrid>
+        <w:gridCol w:w="1487"/>
+        <w:gridCol w:w="1301"/>
+        <w:gridCol w:w="991"/>
+        <w:gridCol w:w="5578"/>
+      </w:tblGrid>
+      <w:tr>
+        <w:trPr>
+          <w:tblHeader w:val="true"/>
+        </w:trPr>
+        <w:tc>
+          <w:tcPr>
+            <w:tcW w:type="dxa" w:w="1487"/>
+            <w:shd w:val="clear" w:color="auto" w:fill="1F3B5C"/>
+          </w:tcPr>
+          <w:p>
+            <w:pPr>
+              <w:pStyle w:val="Compact"/>
+              <w:spacing w:before="40" w:after="40"/>
+              <w:jc w:val="left"/>
+            </w:pPr>
+            <w:r>
+              <w:rPr>
+                <w:bCs/>
+                <w:rFonts w:ascii="Arial" w:hAnsi="Arial"/>
+                <w:b/>
+                <w:color w:val="FFFFFF"/>
+                <w:sz w:val="20"/>
+              </w:rPr>
+              <w:t xml:space="preserve">Sage vendor type</w:t>
+            </w:r>
+          </w:p>
+        </w:tc>
+        <w:tc>
+          <w:tcPr>
+            <w:tcW w:type="dxa" w:w="1301"/>
+            <w:shd w:val="clear" w:color="auto" w:fill="1F3B5C"/>
+          </w:tcPr>
+          <w:p>
+            <w:pPr>
+              <w:pStyle w:val="Compact"/>
+              <w:spacing w:before="40" w:after="40"/>
+              <w:jc w:val="left"/>
+            </w:pPr>
+            <w:r>
+              <w:rPr>
+                <w:bCs/>
+                <w:rFonts w:ascii="Arial" w:hAnsi="Arial"/>
+                <w:b/>
+                <w:color w:val="FFFFFF"/>
+                <w:sz w:val="20"/>
+              </w:rPr>
+              <w:t xml:space="preserve">Vendors</w:t>
+            </w:r>
+          </w:p>
+        </w:tc>
+        <w:tc>
+          <w:tcPr>
+            <w:tcW w:type="dxa" w:w="991"/>
+            <w:shd w:val="clear" w:color="auto" w:fill="1F3B5C"/>
+          </w:tcPr>
+          <w:p>
+            <w:pPr>
+              <w:pStyle w:val="Compact"/>
+              <w:spacing w:before="40" w:after="40"/>
+              <w:jc w:val="left"/>
+            </w:pPr>
+            <w:r>
+              <w:rPr>
+                <w:bCs/>
+                <w:rFonts w:ascii="Arial" w:hAnsi="Arial"/>
+                <w:b/>
+                <w:color w:val="FFFFFF"/>
+                <w:sz w:val="20"/>
+              </w:rPr>
+              <w:t xml:space="preserve">In Ramp</w:t>
+            </w:r>
+          </w:p>
+        </w:tc>
+        <w:tc>
+          <w:tcPr>
+            <w:tcW w:type="dxa" w:w="5578"/>
+            <w:shd w:val="clear" w:color="auto" w:fill="1F3B5C"/>
+          </w:tcPr>
+          <w:p>
+            <w:pPr>
+              <w:pStyle w:val="Compact"/>
+              <w:spacing w:before="40" w:after="40"/>
+              <w:jc w:val="left"/>
+            </w:pPr>
+            <w:r>
+              <w:rPr>
+                <w:bCs/>
+                <w:rFonts w:ascii="Arial" w:hAnsi="Arial"/>
+                <w:b/>
+                <w:color w:val="FFFFFF"/>
+                <w:sz w:val="20"/>
+              </w:rPr>
+              <w:t xml:space="preserve">Note</w:t>
+            </w:r>
+          </w:p>
+        </w:tc>
+      </w:tr>
+      <w:tr>
+        <w:tc>
+          <w:tcPr>
+            <w:tcW w:type="dxa" w:w="1487"/>
+          </w:tcPr>
+          <w:p>
+            <w:pPr>
+              <w:pStyle w:val="Compact"/>
+              <w:spacing w:before="40" w:after="40"/>
+              <w:jc w:val="left"/>
+            </w:pPr>
+            <w:r>
+              <w:rPr>
+                <w:bCs/>
+                <w:rFonts w:ascii="Arial" w:hAnsi="Arial"/>
+                <w:b/>
+                <w:sz w:val="20"/>
+              </w:rPr>
+              <w:t xml:space="preserve">Credit Cards</w:t>
+            </w:r>
+          </w:p>
+        </w:tc>
+        <w:tc>
+          <w:tcPr>
+            <w:tcW w:type="dxa" w:w="1301"/>
+          </w:tcPr>
+          <w:p>
+            <w:pPr>
+              <w:pStyle w:val="Compact"/>
+              <w:spacing w:before="40" w:after="40"/>
+              <w:jc w:val="left"/>
+            </w:pPr>
+            <w:r>
+              <w:rPr>
+                <w:rFonts w:ascii="Arial" w:hAnsi="Arial"/>
+                <w:sz w:val="20"/>
+              </w:rPr>
+              <w:t xml:space="preserve">427</w:t>
+            </w:r>
+          </w:p>
+        </w:tc>
+        <w:tc>
+          <w:tcPr>
+            <w:tcW w:type="dxa" w:w="991"/>
+          </w:tcPr>
+          <w:p>
+            <w:pPr>
+              <w:pStyle w:val="Compact"/>
+              <w:spacing w:before="40" w:after="40"/>
+              <w:jc w:val="left"/>
+            </w:pPr>
+            <w:r>
+              <w:rPr>
+                <w:rFonts w:ascii="Arial" w:hAnsi="Arial"/>
+                <w:sz w:val="20"/>
+              </w:rPr>
+              <w:t xml:space="preserve">123</w:t>
+            </w:r>
+          </w:p>
+        </w:tc>
+        <w:tc>
+          <w:tcPr>
+            <w:tcW w:type="dxa" w:w="5578"/>
+          </w:tcPr>
+          <w:p>
+            <w:pPr>
+              <w:pStyle w:val="Compact"/>
+              <w:spacing w:before="40" w:after="40"/>
+              <w:jc w:val="left"/>
+            </w:pPr>
+            <w:r>
+              <w:rPr>
+                <w:rFonts w:ascii="Arial" w:hAnsi="Arial"/>
+                <w:sz w:val="20"/>
+              </w:rPr>
+              <w:t xml:space="preserve">“</w:t>
+            </w:r>
+            <w:r>
+              <w:rPr>
+                <w:rFonts w:ascii="Arial" w:hAnsi="Arial"/>
+                <w:sz w:val="20"/>
+              </w:rPr>
+              <w:t xml:space="preserve">Never billed</w:t>
+            </w:r>
+            <w:r>
+              <w:rPr>
+                <w:rFonts w:ascii="Arial" w:hAnsi="Arial"/>
+                <w:sz w:val="20"/>
+              </w:rPr>
+              <w:t xml:space="preserve">”</w:t>
+            </w:r>
+            <w:r>
+              <w:rPr>
+                <w:rFonts w:ascii="Arial" w:hAnsi="Arial"/>
+                <w:sz w:val="20"/>
+              </w:rPr>
+              <w:t xml:space="preserve"> </w:t>
+            </w:r>
+            <w:r>
+              <w:rPr>
+                <w:rFonts w:ascii="Arial" w:hAnsi="Arial"/>
+                <w:sz w:val="20"/>
+              </w:rPr>
+              <w:t xml:space="preserve">means no AP bill in Sage: card purchases are booked from the card feed, not as bills. 122 of the 123 in Ramp have Ramp spend. The other 304 are card merchants from before Ramp, plus the card accounts themselves (for example Mastercard - 3584, CHASE CC - ALL CREDIT CARDS)</w:t>
+            </w:r>
+          </w:p>
+        </w:tc>
+      </w:tr>
+      <w:tr>
+        <w:tc>
+          <w:tcPr>
+            <w:tcW w:type="dxa" w:w="1487"/>
+          </w:tcPr>
+          <w:p>
+            <w:pPr>
+              <w:pStyle w:val="Compact"/>
+              <w:spacing w:before="40" w:after="40"/>
+              <w:jc w:val="left"/>
+            </w:pPr>
+            <w:r>
+              <w:rPr>
+                <w:bCs/>
+                <w:rFonts w:ascii="Arial" w:hAnsi="Arial"/>
+                <w:b/>
+                <w:sz w:val="20"/>
+              </w:rPr>
+              <w:t xml:space="preserve">MinIO employee</w:t>
+            </w:r>
+          </w:p>
+        </w:tc>
+        <w:tc>
+          <w:tcPr>
+            <w:tcW w:type="dxa" w:w="1301"/>
+          </w:tcPr>
+          <w:p>
+            <w:pPr>
+              <w:pStyle w:val="Compact"/>
+              <w:spacing w:before="40" w:after="40"/>
+              <w:jc w:val="left"/>
+            </w:pPr>
+            <w:r>
+              <w:rPr>
+                <w:rFonts w:ascii="Arial" w:hAnsi="Arial"/>
+                <w:sz w:val="20"/>
+              </w:rPr>
+              <w:t xml:space="preserve">136</w:t>
+            </w:r>
+          </w:p>
+        </w:tc>
+        <w:tc>
+          <w:tcPr>
+            <w:tcW w:type="dxa" w:w="991"/>
+          </w:tcPr>
+          <w:p>
+            <w:pPr>
+              <w:pStyle w:val="Compact"/>
+              <w:spacing w:before="40" w:after="40"/>
+              <w:jc w:val="left"/>
+            </w:pPr>
+            <w:r>
+              <w:rPr>
+                <w:rFonts w:ascii="Arial" w:hAnsi="Arial"/>
+                <w:sz w:val="20"/>
+              </w:rPr>
+              <w:t xml:space="preserve">1</w:t>
+            </w:r>
+          </w:p>
+        </w:tc>
+        <w:tc>
+          <w:tcPr>
+            <w:tcW w:type="dxa" w:w="5578"/>
+          </w:tcPr>
+          <w:p>
+            <w:pPr>
+              <w:pStyle w:val="Compact"/>
+              <w:spacing w:before="40" w:after="40"/>
+              <w:jc w:val="left"/>
+            </w:pPr>
+            <w:r>
+              <w:rPr>
+                <w:rFonts w:ascii="Arial" w:hAnsi="Arial"/>
+                <w:sz w:val="20"/>
+              </w:rPr>
+              <w:t xml:space="preserve">74 were reimbursed through Sage bills. Ramp reimbursements sync to NetSuite as vendor bills with the employee as the vendor (or one default reimbursement vendor), so employee vendor records are the right home</w:t>
+            </w:r>
+          </w:p>
+        </w:tc>
+      </w:tr>
+      <w:tr>
+        <w:tc>
+          <w:tcPr>
+            <w:tcW w:type="dxa" w:w="1487"/>
+          </w:tcPr>
+          <w:p>
+            <w:pPr>
+              <w:pStyle w:val="Compact"/>
+              <w:spacing w:before="40" w:after="40"/>
+              <w:jc w:val="left"/>
+            </w:pPr>
+            <w:r>
+              <w:rPr>
+                <w:bCs/>
+                <w:rFonts w:ascii="Arial" w:hAnsi="Arial"/>
+                <w:b/>
+                <w:sz w:val="20"/>
+              </w:rPr>
+              <w:t xml:space="preserve">AR reseller</w:t>
+            </w:r>
+          </w:p>
+        </w:tc>
+        <w:tc>
+          <w:tcPr>
+            <w:tcW w:type="dxa" w:w="1301"/>
+          </w:tcPr>
+          <w:p>
+            <w:pPr>
+              <w:pStyle w:val="Compact"/>
+              <w:spacing w:before="40" w:after="40"/>
+              <w:jc w:val="left"/>
+            </w:pPr>
+            <w:r>
+              <w:rPr>
+                <w:rFonts w:ascii="Arial" w:hAnsi="Arial"/>
+                <w:sz w:val="20"/>
+              </w:rPr>
+              <w:t xml:space="preserve">127</w:t>
+            </w:r>
+          </w:p>
+        </w:tc>
+        <w:tc>
+          <w:tcPr>
+            <w:tcW w:type="dxa" w:w="991"/>
+          </w:tcPr>
+          <w:p>
+            <w:pPr>
+              <w:pStyle w:val="Compact"/>
+              <w:spacing w:before="40" w:after="40"/>
+              <w:jc w:val="left"/>
+            </w:pPr>
+            <w:r>
+              <w:rPr>
+                <w:rFonts w:ascii="Arial" w:hAnsi="Arial"/>
+                <w:sz w:val="20"/>
+              </w:rPr>
+              <w:t xml:space="preserve">9</w:t>
+            </w:r>
+          </w:p>
+        </w:tc>
+        <w:tc>
+          <w:tcPr>
+            <w:tcW w:type="dxa" w:w="5578"/>
+          </w:tcPr>
+          <w:p>
+            <w:pPr>
+              <w:pStyle w:val="Compact"/>
+              <w:spacing w:before="40" w:after="40"/>
+              <w:jc w:val="left"/>
+            </w:pPr>
+            <w:r>
+              <w:rPr>
+                <w:rFonts w:ascii="Arial" w:hAnsi="Arial"/>
+                <w:sz w:val="20"/>
+              </w:rPr>
+              <w:t xml:space="preserve">2 billed in Sage</w:t>
+            </w:r>
+          </w:p>
+        </w:tc>
+      </w:tr>
+    </w:tbl>
+    <w:bookmarkEnd w:id="25"/>
+    <w:bookmarkEnd w:id="26"/>
+    <w:bookmarkStart w:id="27" w:name="open-questions"/>
+    <w:p>
+      <w:pPr>
+        <w:pStyle w:val="Heading1"/>
+      </w:pPr>
+      <w:r>
+        <w:t xml:space="preserve">Open questions</w:t>
       </w:r>
     </w:p>
     <w:p>
       <w:pPr>
         <w:numPr>
           <w:ilvl w:val="0"/>
-          <w:numId w:val="1001"/>
+          <w:numId w:val="1002"/>
         </w:numPr>
         <w:pStyle w:val="Compact"/>
       </w:pPr>
@@ -3324,20 +4029,20 @@
           <w:bCs/>
           <w:b/>
         </w:rPr>
-        <w:t xml:space="preserve">MinIO employees.</w:t>
+        <w:t xml:space="preserve">Order of Ramp sync and load.</w:t>
       </w:r>
       <w:r>
         <w:t xml:space="preserve"> </w:t>
       </w:r>
       <w:r>
-        <w:t xml:space="preserve">136 vendors of type MinIO employee, used for reimbursements. NetSuite usually reimburses through employee records. Load as vendors or leave out?</w:t>
+        <w:t xml:space="preserve">Ramp’s NetSuite sync works both ways: it can import existing NetSuite vendors and link Ramp merchants to them. Loading all 1,770 Sage vendors first and then connecting Ramp avoids two problems with syncing first: Ramp-created vendors carry no Sage ID, so the enrichment step has to match by name, and Ramp names that already exist in NetSuite raise duplicate-name errors. Which order does SOA recommend?</w:t>
       </w:r>
     </w:p>
     <w:p>
       <w:pPr>
         <w:numPr>
           <w:ilvl w:val="0"/>
-          <w:numId w:val="1001"/>
+          <w:numId w:val="1002"/>
         </w:numPr>
         <w:pStyle w:val="Compact"/>
       </w:pPr>
@@ -3346,20 +4051,20 @@
           <w:bCs/>
           <w:b/>
         </w:rPr>
-        <w:t xml:space="preserve">AR resellers.</w:t>
+        <w:t xml:space="preserve">Subsidiary for INR and SGD vendors.</w:t>
       </w:r>
       <w:r>
         <w:t xml:space="preserve"> </w:t>
       </w:r>
       <w:r>
-        <w:t xml:space="preserve">127 resellers set up as vendors, 125 never billed. Load only those MinIO pays?</w:t>
+        <w:t xml:space="preserve">Ramp supports several entities mapped to NetSuite subsidiaries, but Ramp’s export shows only MinIO, Inc. as a default entity (79 vendors, the rest blank). Vendors to look up: INR: V-01301 TDS Tax Payable, V-01311 Universal Actuaries and Benefit Consultants, V-01352 and V-01353 Zoho Corporation Private Limited, V-01354 91 Springboard Business Hub Private Limited, V-01380 Resurgent India Limited, V-01381 National Securities Depository Limited, V-01412 S P Nagarajan, V-01459 Vishnu Daya &amp; Co LLP. SGD: V-00628 Cloud Expo Asia Pte. Ltd. Also GBP: V-00629 Reed Exhibitions Ltd. Several INR vendors have United States as their Sage country.</w:t>
       </w:r>
     </w:p>
     <w:p>
       <w:pPr>
         <w:numPr>
           <w:ilvl w:val="0"/>
-          <w:numId w:val="1001"/>
+          <w:numId w:val="1002"/>
         </w:numPr>
         <w:pStyle w:val="Compact"/>
       </w:pPr>
@@ -3368,20 +4073,20 @@
           <w:bCs/>
           <w:b/>
         </w:rPr>
-        <w:t xml:space="preserve">Ramp-only vendors.</w:t>
+        <w:t xml:space="preserve">Bank details import.</w:t>
       </w:r>
       <w:r>
         <w:t xml:space="preserve"> </w:t>
       </w:r>
       <w:r>
-        <w:t xml:space="preserve">27 Ramp vendors have no Sage vendor. Add them to the load?</w:t>
+        <w:t xml:space="preserve">SOA to provide the template for vendor bank details, and confirm whether Ramp syncs bank details to NetSuite.</w:t>
       </w:r>
     </w:p>
     <w:p>
       <w:pPr>
         <w:numPr>
           <w:ilvl w:val="0"/>
-          <w:numId w:val="1001"/>
+          <w:numId w:val="1002"/>
         </w:numPr>
         <w:pStyle w:val="Compact"/>
       </w:pPr>
@@ -3390,82 +4095,16 @@
           <w:bCs/>
           <w:b/>
         </w:rPr>
-        <w:t xml:space="preserve">Tax IDs.</w:t>
+        <w:t xml:space="preserve">Five bank accounts differ</w:t>
       </w:r>
       <w:r>
         <w:t xml:space="preserve"> </w:t>
       </w:r>
       <w:r>
-        <w:t xml:space="preserve">Sage and Ramp hold tax IDs and Ramp holds W-9 classification. Put Tax ID in the load file, or have it entered separately to keep it out of circulated files?</w:t>
+        <w:t xml:space="preserve">between Sage and Ramp. Ramp is assumed current; confirm.</w:t>
       </w:r>
     </w:p>
-    <w:p>
-      <w:pPr>
-        <w:numPr>
-          <w:ilvl w:val="0"/>
-          <w:numId w:val="1001"/>
-        </w:numPr>
-        <w:pStyle w:val="Compact"/>
-      </w:pPr>
-      <w:r>
-        <w:rPr>
-          <w:bCs/>
-          <w:b/>
-        </w:rPr>
-        <w:t xml:space="preserve">Subsidiary.</w:t>
-      </w:r>
-      <w:r>
-        <w:t xml:space="preserve"> </w:t>
-      </w:r>
-      <w:r>
-        <w:t xml:space="preserve">Vendors with INR or SGD currency: MinIO Pvt. Ltd. or MinIO Singapore Pte. Ltd.?</w:t>
-      </w:r>
-    </w:p>
-    <w:p>
-      <w:pPr>
-        <w:numPr>
-          <w:ilvl w:val="0"/>
-          <w:numId w:val="1001"/>
-        </w:numPr>
-        <w:pStyle w:val="Compact"/>
-      </w:pPr>
-      <w:r>
-        <w:rPr>
-          <w:bCs/>
-          <w:b/>
-        </w:rPr>
-        <w:t xml:space="preserve">Vendor ID numbering and duplicates.</w:t>
-      </w:r>
-      <w:r>
-        <w:t xml:space="preserve"> </w:t>
-      </w:r>
-      <w:r>
-        <w:t xml:space="preserve">Apply the customer rules: keep V-#####, renumber V##### and RMP_#, merge duplicates into the most recently used record, NetSuite auto-numbers new vendors from the next number.</w:t>
-      </w:r>
-    </w:p>
-    <w:p>
-      <w:pPr>
-        <w:numPr>
-          <w:ilvl w:val="0"/>
-          <w:numId w:val="1001"/>
-        </w:numPr>
-        <w:pStyle w:val="Compact"/>
-      </w:pPr>
-      <w:r>
-        <w:rPr>
-          <w:bCs/>
-          <w:b/>
-        </w:rPr>
-        <w:t xml:space="preserve">Default Payables Account.</w:t>
-      </w:r>
-      <w:r>
-        <w:t xml:space="preserve"> </w:t>
-      </w:r>
-      <w:r>
-        <w:t xml:space="preserve">20100 Accounts Payable - Trade for every vendor?</w:t>
-      </w:r>
-    </w:p>
-    <w:bookmarkEnd w:id="24"/>
+    <w:bookmarkEnd w:id="27"/>
     <w:sectPr>
       <w:pgSz w:w="12240" w:h="15840"/>
       <w:pgMar w:left="1440" w:right="1440" w:top="1440" w:bottom="1440"/>
@@ -3664,6 +4303,36 @@
     <w:abstractNumId w:val="990"/>
   </w:num>
   <w:num w:numId="1001">
+    <w:abstractNumId w:val="99411"/>
+    <w:lvlOverride w:ilvl="0">
+      <w:startOverride w:val="1"/>
+    </w:lvlOverride>
+    <w:lvlOverride w:ilvl="1">
+      <w:startOverride w:val="1"/>
+    </w:lvlOverride>
+    <w:lvlOverride w:ilvl="2">
+      <w:startOverride w:val="1"/>
+    </w:lvlOverride>
+    <w:lvlOverride w:ilvl="3">
+      <w:startOverride w:val="1"/>
+    </w:lvlOverride>
+    <w:lvlOverride w:ilvl="4">
+      <w:startOverride w:val="1"/>
+    </w:lvlOverride>
+    <w:lvlOverride w:ilvl="5">
+      <w:startOverride w:val="1"/>
+    </w:lvlOverride>
+    <w:lvlOverride w:ilvl="6">
+      <w:startOverride w:val="1"/>
+    </w:lvlOverride>
+    <w:lvlOverride w:ilvl="7">
+      <w:startOverride w:val="1"/>
+    </w:lvlOverride>
+    <w:lvlOverride w:ilvl="8">
+      <w:startOverride w:val="1"/>
+    </w:lvlOverride>
+  </w:num>
+  <w:num w:numId="1002">
     <w:abstractNumId w:val="99411"/>
     <w:lvlOverride w:ilvl="0">
       <w:startOverride w:val="1"/>

</xml_diff>

<commit_message>
Vendors: review table build (Sage mapped to template, Ramp link, masking)
Co-Authored-By: Claude Opus 5.5 <noreply@anthropic.com>
Claude-Session: https://claude.ai/code/session_01RcSpRnw5TDsnk5GdoeWT9P
</commit_message>
<xml_diff>
--- a/netsuite/dataload/vendors/output/vendor-load.docx
+++ b/netsuite/dataload/vendors/output/vendor-load.docx
@@ -273,6 +273,49 @@
                 <w:sz w:val="20"/>
               </w:rPr>
               <w:t xml:space="preserve">Bank details (ACH and wire). The template has no bank fields</w:t>
+            </w:r>
+          </w:p>
+        </w:tc>
+      </w:tr>
+      <w:tr>
+        <w:tc>
+          <w:tcPr>
+            <w:tcW w:type="dxa" w:w="2620"/>
+            <w:shd w:val="clear" w:color="auto" w:fill="F2F4F7"/>
+          </w:tcPr>
+          <w:p>
+            <w:pPr>
+              <w:pStyle w:val="Compact"/>
+              <w:spacing w:before="40" w:after="40"/>
+              <w:jc w:val="left"/>
+            </w:pPr>
+            <w:r>
+              <w:rPr>
+                <w:bCs/>
+                <w:rFonts w:ascii="Arial" w:hAnsi="Arial"/>
+                <w:b/>
+                <w:sz w:val="20"/>
+              </w:rPr>
+              <w:t xml:space="preserve">Review table</w:t>
+            </w:r>
+          </w:p>
+        </w:tc>
+        <w:tc>
+          <w:tcPr>
+            <w:tcW w:type="dxa" w:w="6739"/>
+          </w:tcPr>
+          <w:p>
+            <w:pPr>
+              <w:pStyle w:val="Compact"/>
+              <w:spacing w:before="40" w:after="40"/>
+              <w:jc w:val="left"/>
+            </w:pPr>
+            <w:r>
+              <w:rPr>
+                <w:rFonts w:ascii="Arial" w:hAnsi="Arial"/>
+                <w:sz w:val="20"/>
+              </w:rPr>
+              <w:t xml:space="preserve">Every active Sage vendor mapped to the template, with Ramp coverage and flags: https://claude.ai/artifact/43aBdfBgsyuiGNHAtGPSsw</w:t>
             </w:r>
           </w:p>
         </w:tc>

</xml_diff>

<commit_message>
Vendors: Ramp sync first then enrichment; Ramp primary for bank details; open questions updated
Co-Authored-By: Claude Opus 5.5 <noreply@anthropic.com>
Claude-Session: https://claude.ai/code/session_01RcSpRnw5TDsnk5GdoeWT9P
</commit_message>
<xml_diff>
--- a/netsuite/dataload/vendors/output/vendor-load.docx
+++ b/netsuite/dataload/vendors/output/vendor-load.docx
@@ -3293,7 +3293,7 @@
         <w:pStyle w:val="FirstParagraph"/>
       </w:pPr>
       <w:r>
-        <w:t xml:space="preserve">Agreed 2026-10-26: every active Sage vendor ends up in NetSuite, with Ramp syncing its vendors.</w:t>
+        <w:t xml:space="preserve">Agreed 2026-10-26: Ramp syncs first, then NetSuite is enriched with what Ramp does not push. Every active Sage vendor ends up in NetSuite.</w:t>
       </w:r>
     </w:p>
     <w:p>
@@ -3359,7 +3359,29 @@
         <w:t xml:space="preserve"> </w:t>
       </w:r>
       <w:r>
-        <w:t xml:space="preserve">The 551 vendors in both systems get Sage values Ramp does not hold: Sage Vendor ID, Vendor Category, default expense account, 1099 flag, tax ID where Ramp has none, and bank details where Ramp has none.</w:t>
+        <w:t xml:space="preserve">The 551 vendors in both systems get Sage values Ramp does not hold: Sage Vendor ID, Vendor Category, default expense account, 1099 flag, tax ID where Ramp has none. Ramp-created NetSuite vendors carry no Sage ID, so after the sync the enrichment file is matched to them by Ramp vendor name and Ramp Vendor ID, then re-keyed to the NetSuite internal ID before import.</w:t>
+      </w:r>
+    </w:p>
+    <w:p>
+      <w:pPr>
+        <w:numPr>
+          <w:ilvl w:val="0"/>
+          <w:numId w:val="1001"/>
+        </w:numPr>
+        <w:pStyle w:val="Compact"/>
+      </w:pPr>
+      <w:r>
+        <w:rPr>
+          <w:bCs/>
+          <w:b/>
+        </w:rPr>
+        <w:t xml:space="preserve">Bank details.</w:t>
+      </w:r>
+      <w:r>
+        <w:t xml:space="preserve"> </w:t>
+      </w:r>
+      <w:r>
+        <w:t xml:space="preserve">Ramp does not push bank details to NetSuite, so every vendor’s bank details are imported separately: Ramp’s where Ramp has them (Ramp is primary), else Sage’s.</w:t>
       </w:r>
     </w:p>
     <w:bookmarkStart w:id="24" w:name="bank-details"/>
@@ -3647,7 +3669,7 @@
         <w:pStyle w:val="BodyText"/>
       </w:pPr>
       <w:r>
-        <w:t xml:space="preserve">Ramp’s details are the more recent where both exist. The vendor template has no bank fields, so bank details need their own NetSuite import (vendor bank details record), from Sage for the 94 and from Ramp for the rest if Ramp does not sync them.</w:t>
+        <w:t xml:space="preserve">Ramp is primary where both exist, including the 5 that differ. The vendor template has no bank fields, so bank details need their own NetSuite import (vendor bank details record): 268 vendors, Ramp’s details for 174 and Sage’s for 94.</w:t>
       </w:r>
     </w:p>
     <w:bookmarkEnd w:id="24"/>
@@ -4072,35 +4094,13 @@
           <w:bCs/>
           <w:b/>
         </w:rPr>
-        <w:t xml:space="preserve">Order of Ramp sync and load.</w:t>
-      </w:r>
-      <w:r>
-        <w:t xml:space="preserve"> </w:t>
-      </w:r>
-      <w:r>
-        <w:t xml:space="preserve">Ramp’s NetSuite sync works both ways: it can import existing NetSuite vendors and link Ramp merchants to them. Loading all 1,770 Sage vendors first and then connecting Ramp avoids two problems with syncing first: Ramp-created vendors carry no Sage ID, so the enrichment step has to match by name, and Ramp names that already exist in NetSuite raise duplicate-name errors. Which order does SOA recommend?</w:t>
-      </w:r>
-    </w:p>
-    <w:p>
-      <w:pPr>
-        <w:numPr>
-          <w:ilvl w:val="0"/>
-          <w:numId w:val="1002"/>
-        </w:numPr>
-        <w:pStyle w:val="Compact"/>
-      </w:pPr>
-      <w:r>
-        <w:rPr>
-          <w:bCs/>
-          <w:b/>
-        </w:rPr>
         <w:t xml:space="preserve">Subsidiary for INR and SGD vendors.</w:t>
       </w:r>
       <w:r>
         <w:t xml:space="preserve"> </w:t>
       </w:r>
       <w:r>
-        <w:t xml:space="preserve">Ramp supports several entities mapped to NetSuite subsidiaries, but Ramp’s export shows only MinIO, Inc. as a default entity (79 vendors, the rest blank). Vendors to look up: INR: V-01301 TDS Tax Payable, V-01311 Universal Actuaries and Benefit Consultants, V-01352 and V-01353 Zoho Corporation Private Limited, V-01354 91 Springboard Business Hub Private Limited, V-01380 Resurgent India Limited, V-01381 National Securities Depository Limited, V-01412 S P Nagarajan, V-01459 Vishnu Daya &amp; Co LLP. SGD: V-00628 Cloud Expo Asia Pte. Ltd. Also GBP: V-00629 Reed Exhibitions Ltd. Several INR vendors have United States as their Sage country.</w:t>
+        <w:t xml:space="preserve">None of these has activity in Ramp or bills in Sage. The INR vendors look like MinIO Pvt. Ltd. vendors (India tax, the India office, Indian accountants): V-01301 TDS Tax Payable, V-01311 Universal Actuaries and Benefit Consultants, V-01352 and V-01353 Zoho Corporation Private Limited, V-01354 91 Springboard Business Hub Private Limited, V-01380 Resurgent India Limited, V-01381 National Securities Depository Limited, V-01412 S P Nagarajan, V-01459 Vishnu Daya &amp; Co LLP. SGD: V-00628 Cloud Expo Asia Pte. Ltd. Load them to MinIO Pvt. Ltd. and MinIO Singapore Pte. Ltd., or to MinIO, Inc.? Several INR vendors have United States as their Sage country.</w:t>
       </w:r>
     </w:p>
     <w:p>
@@ -4122,7 +4122,7 @@
         <w:t xml:space="preserve"> </w:t>
       </w:r>
       <w:r>
-        <w:t xml:space="preserve">SOA to provide the template for vendor bank details, and confirm whether Ramp syncs bank details to NetSuite.</w:t>
+        <w:t xml:space="preserve">SOA to provide the template for vendor bank details.</w:t>
       </w:r>
     </w:p>
     <w:p>
@@ -4138,13 +4138,13 @@
           <w:bCs/>
           <w:b/>
         </w:rPr>
-        <w:t xml:space="preserve">Five bank accounts differ</w:t>
+        <w:t xml:space="preserve">Enrichment matching.</w:t>
       </w:r>
       <w:r>
         <w:t xml:space="preserve"> </w:t>
       </w:r>
       <w:r>
-        <w:t xml:space="preserve">between Sage and Ramp. Ramp is assumed current; confirm.</w:t>
+        <w:t xml:space="preserve">After the Ramp sync, SOA to export NetSuite vendors (internal ID, name) so the enrichment and bank files can be keyed to the Ramp-created records. Can Ramp’s External ID field carry the Sage vendor ID into NetSuite, which would make the match exact?</w:t>
       </w:r>
     </w:p>
     <w:bookmarkEnd w:id="27"/>

</xml_diff>

<commit_message>
Vendors: load document notes start with Ramp/Sage breakdown; Ramp-only rows; source categories; mapping doc trimmed
Co-Authored-By: Claude Opus 5.5 <noreply@anthropic.com>
Claude-Session: https://claude.ai/code/session_01RcSpRnw5TDsnk5GdoeWT9P
</commit_message>
<xml_diff>
--- a/netsuite/dataload/vendors/output/vendor-load.docx
+++ b/netsuite/dataload/vendors/output/vendor-load.docx
@@ -7,7 +7,7 @@
         <w:pStyle w:val="Title"/>
       </w:pPr>
       <w:r>
-        <w:t xml:space="preserve">NetSuite vendor load</w:t>
+        <w:t xml:space="preserve">NetSuite vendor column mapping</w:t>
       </w:r>
     </w:p>
     <w:p>
@@ -167,7 +167,7 @@
                 <w:b/>
                 <w:sz w:val="20"/>
               </w:rPr>
-              <w:t xml:space="preserve">Source of truth</w:t>
+              <w:t xml:space="preserve">Sources</w:t>
             </w:r>
           </w:p>
         </w:tc>
@@ -186,7 +186,7 @@
                 <w:rFonts w:ascii="Arial" w:hAnsi="Arial"/>
                 <w:sz w:val="20"/>
               </w:rPr>
-              <w:t xml:space="preserve">Sage Intacct vendor detail export, 1,770 active vendors</w:t>
+              <w:t xml:space="preserve">Ramp vendor export, 578 vendors, synced to NetSuite by Ramp. Sage Intacct vendor detail export, 1,770 active vendors. 551 Ramp vendors carry the Sage vendor ID, so the link is exact</w:t>
             </w:r>
           </w:p>
         </w:tc>
@@ -210,7 +210,7 @@
                 <w:b/>
                 <w:sz w:val="20"/>
               </w:rPr>
-              <w:t xml:space="preserve">Enrichment</w:t>
+              <w:t xml:space="preserve">Bank details</w:t>
             </w:r>
           </w:p>
         </w:tc>
@@ -229,7 +229,7 @@
                 <w:rFonts w:ascii="Arial" w:hAnsi="Arial"/>
                 <w:sz w:val="20"/>
               </w:rPr>
-              <w:t xml:space="preserve">Ramp vendor export, 578 vendors. 551 carry the Sage vendor ID, so the link is exact</w:t>
+              <w:t xml:space="preserve">Not in the template: a separate import, Ramp’s details first, else Sage’s</w:t>
             </w:r>
           </w:p>
         </w:tc>
@@ -253,7 +253,7 @@
                 <w:b/>
                 <w:sz w:val="20"/>
               </w:rPr>
-              <w:t xml:space="preserve">Not loaded</w:t>
+              <w:t xml:space="preserve">Vendor load document</w:t>
             </w:r>
           </w:p>
         </w:tc>
@@ -272,93 +272,7 @@
                 <w:rFonts w:ascii="Arial" w:hAnsi="Arial"/>
                 <w:sz w:val="20"/>
               </w:rPr>
-              <w:t xml:space="preserve">Bank details (ACH and wire). The template has no bank fields</w:t>
-            </w:r>
-          </w:p>
-        </w:tc>
-      </w:tr>
-      <w:tr>
-        <w:tc>
-          <w:tcPr>
-            <w:tcW w:type="dxa" w:w="2620"/>
-            <w:shd w:val="clear" w:color="auto" w:fill="F2F4F7"/>
-          </w:tcPr>
-          <w:p>
-            <w:pPr>
-              <w:pStyle w:val="Compact"/>
-              <w:spacing w:before="40" w:after="40"/>
-              <w:jc w:val="left"/>
-            </w:pPr>
-            <w:r>
-              <w:rPr>
-                <w:bCs/>
-                <w:rFonts w:ascii="Arial" w:hAnsi="Arial"/>
-                <w:b/>
-                <w:sz w:val="20"/>
-              </w:rPr>
-              <w:t xml:space="preserve">Review table</w:t>
-            </w:r>
-          </w:p>
-        </w:tc>
-        <w:tc>
-          <w:tcPr>
-            <w:tcW w:type="dxa" w:w="6739"/>
-          </w:tcPr>
-          <w:p>
-            <w:pPr>
-              <w:pStyle w:val="Compact"/>
-              <w:spacing w:before="40" w:after="40"/>
-              <w:jc w:val="left"/>
-            </w:pPr>
-            <w:r>
-              <w:rPr>
-                <w:rFonts w:ascii="Arial" w:hAnsi="Arial"/>
-                <w:sz w:val="20"/>
-              </w:rPr>
-              <w:t xml:space="preserve">Every active Sage vendor mapped to the template, with Ramp coverage and flags: https://claude.ai/artifact/43aBdfBgsyuiGNHAtGPSsw</w:t>
-            </w:r>
-          </w:p>
-        </w:tc>
-      </w:tr>
-      <w:tr>
-        <w:tc>
-          <w:tcPr>
-            <w:tcW w:type="dxa" w:w="2620"/>
-            <w:shd w:val="clear" w:color="auto" w:fill="F2F4F7"/>
-          </w:tcPr>
-          <w:p>
-            <w:pPr>
-              <w:pStyle w:val="Compact"/>
-              <w:spacing w:before="40" w:after="40"/>
-              <w:jc w:val="left"/>
-            </w:pPr>
-            <w:r>
-              <w:rPr>
-                <w:bCs/>
-                <w:rFonts w:ascii="Arial" w:hAnsi="Arial"/>
-                <w:b/>
-                <w:sz w:val="20"/>
-              </w:rPr>
-              <w:t xml:space="preserve">Status</w:t>
-            </w:r>
-          </w:p>
-        </w:tc>
-        <w:tc>
-          <w:tcPr>
-            <w:tcW w:type="dxa" w:w="6739"/>
-          </w:tcPr>
-          <w:p>
-            <w:pPr>
-              <w:pStyle w:val="Compact"/>
-              <w:spacing w:before="40" w:after="40"/>
-              <w:jc w:val="left"/>
-            </w:pPr>
-            <w:r>
-              <w:rPr>
-                <w:rFonts w:ascii="Arial" w:hAnsi="Arial"/>
-                <w:sz w:val="20"/>
-              </w:rPr>
-              <w:t xml:space="preserve">Scope and rules agreed 2026-10-26. Load plan and remaining questions below</w:t>
+              <w:t xml:space="preserve">The table of every vendor, with the breakdown, load plan, bank details and open questions in its Notes: https://claude.ai/artifact/43aBdfBgsyuiGNHAtGPSsw</w:t>
             </w:r>
           </w:p>
         </w:tc>
@@ -2281,1873 +2195,6 @@
     </w:p>
     <w:bookmarkEnd w:id="21"/>
     <w:bookmarkEnd w:id="22"/>
-    <w:bookmarkStart w:id="23" w:name="scope"/>
-    <w:p>
-      <w:pPr>
-        <w:pStyle w:val="Heading1"/>
-      </w:pPr>
-      <w:r>
-        <w:t xml:space="preserve">Scope</w:t>
-      </w:r>
-    </w:p>
-    <w:p>
-      <w:pPr>
-        <w:pStyle w:val="FirstParagraph"/>
-      </w:pPr>
-      <w:r>
-        <w:t xml:space="preserve">Sage has 1,770 active vendors, but most have no recorded activity. Activity is the latest of Sage last bill, Sage last payment and Ramp last spend.</w:t>
-      </w:r>
-    </w:p>
-    <w:tbl>
-      <w:tblPr>
-        <w:tblStyle w:val="Table"/>
-        <w:tblW w:type="dxa" w:w="9360"/>
-        <w:jc w:val="center"/>
-        <w:tblLook w:firstRow="1" w:lastRow="0" w:firstColumn="0" w:lastColumn="0" w:noHBand="0" w:noVBand="0" w:val="0020"/>
-        <w:tblBorders>
-          <w:top w:val="single" w:sz="4" w:space="0" w:color="BFC7D1"/>
-          <w:left w:val="single" w:sz="4" w:space="0" w:color="BFC7D1"/>
-          <w:bottom w:val="single" w:sz="4" w:space="0" w:color="BFC7D1"/>
-          <w:right w:val="single" w:sz="4" w:space="0" w:color="BFC7D1"/>
-          <w:insideH w:val="single" w:sz="4" w:space="0" w:color="BFC7D1"/>
-          <w:insideV w:val="single" w:sz="4" w:space="0" w:color="BFC7D1"/>
-        </w:tblBorders>
-        <w:tblLayout w:type="fixed"/>
-      </w:tblPr>
-      <w:tblGrid>
-        <w:gridCol w:w="3600"/>
-        <w:gridCol w:w="1920"/>
-        <w:gridCol w:w="1920"/>
-        <w:gridCol w:w="1920"/>
-      </w:tblGrid>
-      <w:tr>
-        <w:trPr>
-          <w:tblHeader w:val="true"/>
-        </w:trPr>
-        <w:tc>
-          <w:tcPr>
-            <w:tcW w:type="dxa" w:w="3600"/>
-            <w:shd w:val="clear" w:color="auto" w:fill="1F3B5C"/>
-          </w:tcPr>
-          <w:p>
-            <w:pPr>
-              <w:pStyle w:val="Compact"/>
-              <w:spacing w:before="40" w:after="40"/>
-              <w:jc w:val="left"/>
-            </w:pPr>
-            <w:r>
-              <w:rPr>
-                <w:bCs/>
-                <w:rFonts w:ascii="Arial" w:hAnsi="Arial"/>
-                <w:b/>
-                <w:color w:val="FFFFFF"/>
-                <w:sz w:val="20"/>
-              </w:rPr>
-              <w:t xml:space="preserve">Activity</w:t>
-            </w:r>
-          </w:p>
-        </w:tc>
-        <w:tc>
-          <w:tcPr>
-            <w:tcW w:type="dxa" w:w="1920"/>
-            <w:shd w:val="clear" w:color="auto" w:fill="1F3B5C"/>
-          </w:tcPr>
-          <w:p>
-            <w:pPr>
-              <w:pStyle w:val="Compact"/>
-              <w:spacing w:before="40" w:after="40"/>
-              <w:jc w:val="left"/>
-            </w:pPr>
-            <w:r>
-              <w:rPr>
-                <w:bCs/>
-                <w:rFonts w:ascii="Arial" w:hAnsi="Arial"/>
-                <w:b/>
-                <w:color w:val="FFFFFF"/>
-                <w:sz w:val="20"/>
-              </w:rPr>
-              <w:t xml:space="preserve">In Ramp</w:t>
-            </w:r>
-          </w:p>
-        </w:tc>
-        <w:tc>
-          <w:tcPr>
-            <w:tcW w:type="dxa" w:w="1920"/>
-            <w:shd w:val="clear" w:color="auto" w:fill="1F3B5C"/>
-          </w:tcPr>
-          <w:p>
-            <w:pPr>
-              <w:pStyle w:val="Compact"/>
-              <w:spacing w:before="40" w:after="40"/>
-              <w:jc w:val="left"/>
-            </w:pPr>
-            <w:r>
-              <w:rPr>
-                <w:bCs/>
-                <w:rFonts w:ascii="Arial" w:hAnsi="Arial"/>
-                <w:b/>
-                <w:color w:val="FFFFFF"/>
-                <w:sz w:val="20"/>
-              </w:rPr>
-              <w:t xml:space="preserve">Not in Ramp</w:t>
-            </w:r>
-          </w:p>
-        </w:tc>
-        <w:tc>
-          <w:tcPr>
-            <w:tcW w:type="dxa" w:w="1920"/>
-            <w:shd w:val="clear" w:color="auto" w:fill="1F3B5C"/>
-          </w:tcPr>
-          <w:p>
-            <w:pPr>
-              <w:pStyle w:val="Compact"/>
-              <w:spacing w:before="40" w:after="40"/>
-              <w:jc w:val="left"/>
-            </w:pPr>
-            <w:r>
-              <w:rPr>
-                <w:bCs/>
-                <w:rFonts w:ascii="Arial" w:hAnsi="Arial"/>
-                <w:b/>
-                <w:color w:val="FFFFFF"/>
-                <w:sz w:val="20"/>
-              </w:rPr>
-              <w:t xml:space="preserve">Total</w:t>
-            </w:r>
-          </w:p>
-        </w:tc>
-      </w:tr>
-      <w:tr>
-        <w:tc>
-          <w:tcPr>
-            <w:tcW w:type="dxa" w:w="3600"/>
-          </w:tcPr>
-          <w:p>
-            <w:pPr>
-              <w:pStyle w:val="Compact"/>
-              <w:spacing w:before="40" w:after="40"/>
-              <w:jc w:val="left"/>
-            </w:pPr>
-            <w:r>
-              <w:rPr>
-                <w:bCs/>
-                <w:rFonts w:ascii="Arial" w:hAnsi="Arial"/>
-                <w:b/>
-                <w:sz w:val="20"/>
-              </w:rPr>
-              <w:t xml:space="preserve">Since 2024-10-26</w:t>
-            </w:r>
-          </w:p>
-        </w:tc>
-        <w:tc>
-          <w:tcPr>
-            <w:tcW w:type="dxa" w:w="1920"/>
-          </w:tcPr>
-          <w:p>
-            <w:pPr>
-              <w:pStyle w:val="Compact"/>
-              <w:spacing w:before="40" w:after="40"/>
-              <w:jc w:val="left"/>
-            </w:pPr>
-            <w:r>
-              <w:rPr>
-                <w:rFonts w:ascii="Arial" w:hAnsi="Arial"/>
-                <w:sz w:val="20"/>
-              </w:rPr>
-              <w:t xml:space="preserve">478</w:t>
-            </w:r>
-          </w:p>
-        </w:tc>
-        <w:tc>
-          <w:tcPr>
-            <w:tcW w:type="dxa" w:w="1920"/>
-          </w:tcPr>
-          <w:p>
-            <w:pPr>
-              <w:pStyle w:val="Compact"/>
-              <w:spacing w:before="40" w:after="40"/>
-              <w:jc w:val="left"/>
-            </w:pPr>
-            <w:r>
-              <w:rPr>
-                <w:rFonts w:ascii="Arial" w:hAnsi="Arial"/>
-                <w:sz w:val="20"/>
-              </w:rPr>
-              <w:t xml:space="preserve">85</w:t>
-            </w:r>
-          </w:p>
-        </w:tc>
-        <w:tc>
-          <w:tcPr>
-            <w:tcW w:type="dxa" w:w="1920"/>
-          </w:tcPr>
-          <w:p>
-            <w:pPr>
-              <w:pStyle w:val="Compact"/>
-              <w:spacing w:before="40" w:after="40"/>
-              <w:jc w:val="left"/>
-            </w:pPr>
-            <w:r>
-              <w:rPr>
-                <w:rFonts w:ascii="Arial" w:hAnsi="Arial"/>
-                <w:sz w:val="20"/>
-              </w:rPr>
-              <w:t xml:space="preserve">563</w:t>
-            </w:r>
-          </w:p>
-        </w:tc>
-      </w:tr>
-      <w:tr>
-        <w:tc>
-          <w:tcPr>
-            <w:tcW w:type="dxa" w:w="3600"/>
-          </w:tcPr>
-          <w:p>
-            <w:pPr>
-              <w:pStyle w:val="Compact"/>
-              <w:spacing w:before="40" w:after="40"/>
-              <w:jc w:val="left"/>
-            </w:pPr>
-            <w:r>
-              <w:rPr>
-                <w:bCs/>
-                <w:rFonts w:ascii="Arial" w:hAnsi="Arial"/>
-                <w:b/>
-                <w:sz w:val="20"/>
-              </w:rPr>
-              <w:t xml:space="preserve">Before 2024-10-26</w:t>
-            </w:r>
-          </w:p>
-        </w:tc>
-        <w:tc>
-          <w:tcPr>
-            <w:tcW w:type="dxa" w:w="1920"/>
-          </w:tcPr>
-          <w:p>
-            <w:pPr>
-              <w:pStyle w:val="Compact"/>
-              <w:spacing w:before="40" w:after="40"/>
-              <w:jc w:val="left"/>
-            </w:pPr>
-            <w:r>
-              <w:rPr>
-                <w:rFonts w:ascii="Arial" w:hAnsi="Arial"/>
-                <w:sz w:val="20"/>
-              </w:rPr>
-              <w:t xml:space="preserve">8</w:t>
-            </w:r>
-          </w:p>
-        </w:tc>
-        <w:tc>
-          <w:tcPr>
-            <w:tcW w:type="dxa" w:w="1920"/>
-          </w:tcPr>
-          <w:p>
-            <w:pPr>
-              <w:pStyle w:val="Compact"/>
-              <w:spacing w:before="40" w:after="40"/>
-              <w:jc w:val="left"/>
-            </w:pPr>
-            <w:r>
-              <w:rPr>
-                <w:rFonts w:ascii="Arial" w:hAnsi="Arial"/>
-                <w:sz w:val="20"/>
-              </w:rPr>
-              <w:t xml:space="preserve">292</w:t>
-            </w:r>
-          </w:p>
-        </w:tc>
-        <w:tc>
-          <w:tcPr>
-            <w:tcW w:type="dxa" w:w="1920"/>
-          </w:tcPr>
-          <w:p>
-            <w:pPr>
-              <w:pStyle w:val="Compact"/>
-              <w:spacing w:before="40" w:after="40"/>
-              <w:jc w:val="left"/>
-            </w:pPr>
-            <w:r>
-              <w:rPr>
-                <w:rFonts w:ascii="Arial" w:hAnsi="Arial"/>
-                <w:sz w:val="20"/>
-              </w:rPr>
-              <w:t xml:space="preserve">300</w:t>
-            </w:r>
-          </w:p>
-        </w:tc>
-      </w:tr>
-      <w:tr>
-        <w:tc>
-          <w:tcPr>
-            <w:tcW w:type="dxa" w:w="3600"/>
-          </w:tcPr>
-          <w:p>
-            <w:pPr>
-              <w:pStyle w:val="Compact"/>
-              <w:spacing w:before="40" w:after="40"/>
-              <w:jc w:val="left"/>
-            </w:pPr>
-            <w:r>
-              <w:rPr>
-                <w:bCs/>
-                <w:rFonts w:ascii="Arial" w:hAnsi="Arial"/>
-                <w:b/>
-                <w:sz w:val="20"/>
-              </w:rPr>
-              <w:t xml:space="preserve">None recorded</w:t>
-            </w:r>
-          </w:p>
-        </w:tc>
-        <w:tc>
-          <w:tcPr>
-            <w:tcW w:type="dxa" w:w="1920"/>
-          </w:tcPr>
-          <w:p>
-            <w:pPr>
-              <w:pStyle w:val="Compact"/>
-              <w:spacing w:before="40" w:after="40"/>
-              <w:jc w:val="left"/>
-            </w:pPr>
-            <w:r>
-              <w:rPr>
-                <w:rFonts w:ascii="Arial" w:hAnsi="Arial"/>
-                <w:sz w:val="20"/>
-              </w:rPr>
-              <w:t xml:space="preserve">65</w:t>
-            </w:r>
-          </w:p>
-        </w:tc>
-        <w:tc>
-          <w:tcPr>
-            <w:tcW w:type="dxa" w:w="1920"/>
-          </w:tcPr>
-          <w:p>
-            <w:pPr>
-              <w:pStyle w:val="Compact"/>
-              <w:spacing w:before="40" w:after="40"/>
-              <w:jc w:val="left"/>
-            </w:pPr>
-            <w:r>
-              <w:rPr>
-                <w:rFonts w:ascii="Arial" w:hAnsi="Arial"/>
-                <w:sz w:val="20"/>
-              </w:rPr>
-              <w:t xml:space="preserve">842</w:t>
-            </w:r>
-          </w:p>
-        </w:tc>
-        <w:tc>
-          <w:tcPr>
-            <w:tcW w:type="dxa" w:w="1920"/>
-          </w:tcPr>
-          <w:p>
-            <w:pPr>
-              <w:pStyle w:val="Compact"/>
-              <w:spacing w:before="40" w:after="40"/>
-              <w:jc w:val="left"/>
-            </w:pPr>
-            <w:r>
-              <w:rPr>
-                <w:rFonts w:ascii="Arial" w:hAnsi="Arial"/>
-                <w:sz w:val="20"/>
-              </w:rPr>
-              <w:t xml:space="preserve">907</w:t>
-            </w:r>
-          </w:p>
-        </w:tc>
-      </w:tr>
-      <w:tr>
-        <w:tc>
-          <w:tcPr>
-            <w:tcW w:type="dxa" w:w="3600"/>
-          </w:tcPr>
-          <w:p>
-            <w:pPr>
-              <w:pStyle w:val="Compact"/>
-              <w:spacing w:before="40" w:after="40"/>
-              <w:jc w:val="left"/>
-            </w:pPr>
-            <w:r>
-              <w:rPr>
-                <w:bCs/>
-                <w:rFonts w:ascii="Arial" w:hAnsi="Arial"/>
-                <w:b/>
-                <w:sz w:val="20"/>
-              </w:rPr>
-              <w:t xml:space="preserve">Total</w:t>
-            </w:r>
-          </w:p>
-        </w:tc>
-        <w:tc>
-          <w:tcPr>
-            <w:tcW w:type="dxa" w:w="1920"/>
-          </w:tcPr>
-          <w:p>
-            <w:pPr>
-              <w:pStyle w:val="Compact"/>
-              <w:spacing w:before="40" w:after="40"/>
-              <w:jc w:val="left"/>
-            </w:pPr>
-            <w:r>
-              <w:rPr>
-                <w:rFonts w:ascii="Arial" w:hAnsi="Arial"/>
-                <w:sz w:val="20"/>
-              </w:rPr>
-              <w:t xml:space="preserve">551</w:t>
-            </w:r>
-          </w:p>
-        </w:tc>
-        <w:tc>
-          <w:tcPr>
-            <w:tcW w:type="dxa" w:w="1920"/>
-          </w:tcPr>
-          <w:p>
-            <w:pPr>
-              <w:pStyle w:val="Compact"/>
-              <w:spacing w:before="40" w:after="40"/>
-              <w:jc w:val="left"/>
-            </w:pPr>
-            <w:r>
-              <w:rPr>
-                <w:rFonts w:ascii="Arial" w:hAnsi="Arial"/>
-                <w:sz w:val="20"/>
-              </w:rPr>
-              <w:t xml:space="preserve">1,219</w:t>
-            </w:r>
-          </w:p>
-        </w:tc>
-        <w:tc>
-          <w:tcPr>
-            <w:tcW w:type="dxa" w:w="1920"/>
-          </w:tcPr>
-          <w:p>
-            <w:pPr>
-              <w:pStyle w:val="Compact"/>
-              <w:spacing w:before="40" w:after="40"/>
-              <w:jc w:val="left"/>
-            </w:pPr>
-            <w:r>
-              <w:rPr>
-                <w:rFonts w:ascii="Arial" w:hAnsi="Arial"/>
-                <w:sz w:val="20"/>
-              </w:rPr>
-              <w:t xml:space="preserve">1,770</w:t>
-            </w:r>
-          </w:p>
-        </w:tc>
-      </w:tr>
-    </w:tbl>
-    <w:p/>
-    <w:tbl>
-      <w:tblPr>
-        <w:tblStyle w:val="Table"/>
-        <w:tblW w:type="dxa" w:w="9360"/>
-        <w:jc w:val="center"/>
-        <w:tblLook w:firstRow="1" w:lastRow="0" w:firstColumn="0" w:lastColumn="0" w:noHBand="0" w:noVBand="0" w:val="0020"/>
-        <w:tblBorders>
-          <w:top w:val="single" w:sz="4" w:space="0" w:color="BFC7D1"/>
-          <w:left w:val="single" w:sz="4" w:space="0" w:color="BFC7D1"/>
-          <w:bottom w:val="single" w:sz="4" w:space="0" w:color="BFC7D1"/>
-          <w:right w:val="single" w:sz="4" w:space="0" w:color="BFC7D1"/>
-          <w:insideH w:val="single" w:sz="4" w:space="0" w:color="BFC7D1"/>
-          <w:insideV w:val="single" w:sz="4" w:space="0" w:color="BFC7D1"/>
-        </w:tblBorders>
-        <w:tblLayout w:type="fixed"/>
-      </w:tblPr>
-      <w:tblGrid>
-        <w:gridCol w:w="3456"/>
-        <w:gridCol w:w="3024"/>
-        <w:gridCol w:w="2880"/>
-      </w:tblGrid>
-      <w:tr>
-        <w:trPr>
-          <w:tblHeader w:val="true"/>
-        </w:trPr>
-        <w:tc>
-          <w:tcPr>
-            <w:tcW w:type="dxa" w:w="3456"/>
-            <w:shd w:val="clear" w:color="auto" w:fill="1F3B5C"/>
-          </w:tcPr>
-          <w:p>
-            <w:pPr>
-              <w:pStyle w:val="Compact"/>
-              <w:spacing w:before="40" w:after="40"/>
-              <w:jc w:val="left"/>
-            </w:pPr>
-            <w:r>
-              <w:rPr>
-                <w:bCs/>
-                <w:rFonts w:ascii="Arial" w:hAnsi="Arial"/>
-                <w:b/>
-                <w:color w:val="FFFFFF"/>
-                <w:sz w:val="20"/>
-              </w:rPr>
-              <w:t xml:space="preserve">Sage vendor type</w:t>
-            </w:r>
-          </w:p>
-        </w:tc>
-        <w:tc>
-          <w:tcPr>
-            <w:tcW w:type="dxa" w:w="3024"/>
-            <w:shd w:val="clear" w:color="auto" w:fill="1F3B5C"/>
-          </w:tcPr>
-          <w:p>
-            <w:pPr>
-              <w:pStyle w:val="Compact"/>
-              <w:spacing w:before="40" w:after="40"/>
-              <w:jc w:val="left"/>
-            </w:pPr>
-            <w:r>
-              <w:rPr>
-                <w:bCs/>
-                <w:rFonts w:ascii="Arial" w:hAnsi="Arial"/>
-                <w:b/>
-                <w:color w:val="FFFFFF"/>
-                <w:sz w:val="20"/>
-              </w:rPr>
-              <w:t xml:space="preserve">Vendors</w:t>
-            </w:r>
-          </w:p>
-        </w:tc>
-        <w:tc>
-          <w:tcPr>
-            <w:tcW w:type="dxa" w:w="2880"/>
-            <w:shd w:val="clear" w:color="auto" w:fill="1F3B5C"/>
-          </w:tcPr>
-          <w:p>
-            <w:pPr>
-              <w:pStyle w:val="Compact"/>
-              <w:spacing w:before="40" w:after="40"/>
-              <w:jc w:val="left"/>
-            </w:pPr>
-            <w:r>
-              <w:rPr>
-                <w:bCs/>
-                <w:rFonts w:ascii="Arial" w:hAnsi="Arial"/>
-                <w:b/>
-                <w:color w:val="FFFFFF"/>
-                <w:sz w:val="20"/>
-              </w:rPr>
-              <w:t xml:space="preserve">Never billed in Sage</w:t>
-            </w:r>
-          </w:p>
-        </w:tc>
-      </w:tr>
-      <w:tr>
-        <w:tc>
-          <w:tcPr>
-            <w:tcW w:type="dxa" w:w="3456"/>
-          </w:tcPr>
-          <w:p>
-            <w:pPr>
-              <w:pStyle w:val="Compact"/>
-              <w:spacing w:before="40" w:after="40"/>
-              <w:jc w:val="left"/>
-            </w:pPr>
-            <w:r>
-              <w:rPr>
-                <w:bCs/>
-                <w:rFonts w:ascii="Arial" w:hAnsi="Arial"/>
-                <w:b/>
-                <w:sz w:val="20"/>
-              </w:rPr>
-              <w:t xml:space="preserve">Blank</w:t>
-            </w:r>
-          </w:p>
-        </w:tc>
-        <w:tc>
-          <w:tcPr>
-            <w:tcW w:type="dxa" w:w="3024"/>
-          </w:tcPr>
-          <w:p>
-            <w:pPr>
-              <w:pStyle w:val="Compact"/>
-              <w:spacing w:before="40" w:after="40"/>
-              <w:jc w:val="left"/>
-            </w:pPr>
-            <w:r>
-              <w:rPr>
-                <w:rFonts w:ascii="Arial" w:hAnsi="Arial"/>
-                <w:sz w:val="20"/>
-              </w:rPr>
-              <w:t xml:space="preserve">922</w:t>
-            </w:r>
-          </w:p>
-        </w:tc>
-        <w:tc>
-          <w:tcPr>
-            <w:tcW w:type="dxa" w:w="2880"/>
-          </w:tcPr>
-          <w:p>
-            <w:pPr>
-              <w:pStyle w:val="Compact"/>
-              <w:spacing w:before="40" w:after="40"/>
-              <w:jc w:val="left"/>
-            </w:pPr>
-            <w:r>
-              <w:rPr>
-                <w:rFonts w:ascii="Arial" w:hAnsi="Arial"/>
-                <w:sz w:val="20"/>
-              </w:rPr>
-              <w:t xml:space="preserve">565</w:t>
-            </w:r>
-          </w:p>
-        </w:tc>
-      </w:tr>
-      <w:tr>
-        <w:tc>
-          <w:tcPr>
-            <w:tcW w:type="dxa" w:w="3456"/>
-          </w:tcPr>
-          <w:p>
-            <w:pPr>
-              <w:pStyle w:val="Compact"/>
-              <w:spacing w:before="40" w:after="40"/>
-              <w:jc w:val="left"/>
-            </w:pPr>
-            <w:r>
-              <w:rPr>
-                <w:bCs/>
-                <w:rFonts w:ascii="Arial" w:hAnsi="Arial"/>
-                <w:b/>
-                <w:sz w:val="20"/>
-              </w:rPr>
-              <w:t xml:space="preserve">Credit Cards</w:t>
-            </w:r>
-          </w:p>
-        </w:tc>
-        <w:tc>
-          <w:tcPr>
-            <w:tcW w:type="dxa" w:w="3024"/>
-          </w:tcPr>
-          <w:p>
-            <w:pPr>
-              <w:pStyle w:val="Compact"/>
-              <w:spacing w:before="40" w:after="40"/>
-              <w:jc w:val="left"/>
-            </w:pPr>
-            <w:r>
-              <w:rPr>
-                <w:rFonts w:ascii="Arial" w:hAnsi="Arial"/>
-                <w:sz w:val="20"/>
-              </w:rPr>
-              <w:t xml:space="preserve">427</w:t>
-            </w:r>
-          </w:p>
-        </w:tc>
-        <w:tc>
-          <w:tcPr>
-            <w:tcW w:type="dxa" w:w="2880"/>
-          </w:tcPr>
-          <w:p>
-            <w:pPr>
-              <w:pStyle w:val="Compact"/>
-              <w:spacing w:before="40" w:after="40"/>
-              <w:jc w:val="left"/>
-            </w:pPr>
-            <w:r>
-              <w:rPr>
-                <w:rFonts w:ascii="Arial" w:hAnsi="Arial"/>
-                <w:sz w:val="20"/>
-              </w:rPr>
-              <w:t xml:space="preserve">418</w:t>
-            </w:r>
-          </w:p>
-        </w:tc>
-      </w:tr>
-      <w:tr>
-        <w:tc>
-          <w:tcPr>
-            <w:tcW w:type="dxa" w:w="3456"/>
-          </w:tcPr>
-          <w:p>
-            <w:pPr>
-              <w:pStyle w:val="Compact"/>
-              <w:spacing w:before="40" w:after="40"/>
-              <w:jc w:val="left"/>
-            </w:pPr>
-            <w:r>
-              <w:rPr>
-                <w:bCs/>
-                <w:rFonts w:ascii="Arial" w:hAnsi="Arial"/>
-                <w:b/>
-                <w:sz w:val="20"/>
-              </w:rPr>
-              <w:t xml:space="preserve">MinIO employee</w:t>
-            </w:r>
-          </w:p>
-        </w:tc>
-        <w:tc>
-          <w:tcPr>
-            <w:tcW w:type="dxa" w:w="3024"/>
-          </w:tcPr>
-          <w:p>
-            <w:pPr>
-              <w:pStyle w:val="Compact"/>
-              <w:spacing w:before="40" w:after="40"/>
-              <w:jc w:val="left"/>
-            </w:pPr>
-            <w:r>
-              <w:rPr>
-                <w:rFonts w:ascii="Arial" w:hAnsi="Arial"/>
-                <w:sz w:val="20"/>
-              </w:rPr>
-              <w:t xml:space="preserve">136</w:t>
-            </w:r>
-          </w:p>
-        </w:tc>
-        <w:tc>
-          <w:tcPr>
-            <w:tcW w:type="dxa" w:w="2880"/>
-          </w:tcPr>
-          <w:p>
-            <w:pPr>
-              <w:pStyle w:val="Compact"/>
-              <w:spacing w:before="40" w:after="40"/>
-              <w:jc w:val="left"/>
-            </w:pPr>
-            <w:r>
-              <w:rPr>
-                <w:rFonts w:ascii="Arial" w:hAnsi="Arial"/>
-                <w:sz w:val="20"/>
-              </w:rPr>
-              <w:t xml:space="preserve">62</w:t>
-            </w:r>
-          </w:p>
-        </w:tc>
-      </w:tr>
-      <w:tr>
-        <w:tc>
-          <w:tcPr>
-            <w:tcW w:type="dxa" w:w="3456"/>
-          </w:tcPr>
-          <w:p>
-            <w:pPr>
-              <w:pStyle w:val="Compact"/>
-              <w:spacing w:before="40" w:after="40"/>
-              <w:jc w:val="left"/>
-            </w:pPr>
-            <w:r>
-              <w:rPr>
-                <w:bCs/>
-                <w:rFonts w:ascii="Arial" w:hAnsi="Arial"/>
-                <w:b/>
-                <w:sz w:val="20"/>
-              </w:rPr>
-              <w:t xml:space="preserve">AR reseller</w:t>
-            </w:r>
-          </w:p>
-        </w:tc>
-        <w:tc>
-          <w:tcPr>
-            <w:tcW w:type="dxa" w:w="3024"/>
-          </w:tcPr>
-          <w:p>
-            <w:pPr>
-              <w:pStyle w:val="Compact"/>
-              <w:spacing w:before="40" w:after="40"/>
-              <w:jc w:val="left"/>
-            </w:pPr>
-            <w:r>
-              <w:rPr>
-                <w:rFonts w:ascii="Arial" w:hAnsi="Arial"/>
-                <w:sz w:val="20"/>
-              </w:rPr>
-              <w:t xml:space="preserve">127</w:t>
-            </w:r>
-          </w:p>
-        </w:tc>
-        <w:tc>
-          <w:tcPr>
-            <w:tcW w:type="dxa" w:w="2880"/>
-          </w:tcPr>
-          <w:p>
-            <w:pPr>
-              <w:pStyle w:val="Compact"/>
-              <w:spacing w:before="40" w:after="40"/>
-              <w:jc w:val="left"/>
-            </w:pPr>
-            <w:r>
-              <w:rPr>
-                <w:rFonts w:ascii="Arial" w:hAnsi="Arial"/>
-                <w:sz w:val="20"/>
-              </w:rPr>
-              <w:t xml:space="preserve">125</w:t>
-            </w:r>
-          </w:p>
-        </w:tc>
-      </w:tr>
-      <w:tr>
-        <w:tc>
-          <w:tcPr>
-            <w:tcW w:type="dxa" w:w="3456"/>
-          </w:tcPr>
-          <w:p>
-            <w:pPr>
-              <w:pStyle w:val="Compact"/>
-              <w:spacing w:before="40" w:after="40"/>
-              <w:jc w:val="left"/>
-            </w:pPr>
-            <w:r>
-              <w:rPr>
-                <w:bCs/>
-                <w:rFonts w:ascii="Arial" w:hAnsi="Arial"/>
-                <w:b/>
-                <w:sz w:val="20"/>
-              </w:rPr>
-              <w:t xml:space="preserve">1099 Vendor</w:t>
-            </w:r>
-          </w:p>
-        </w:tc>
-        <w:tc>
-          <w:tcPr>
-            <w:tcW w:type="dxa" w:w="3024"/>
-          </w:tcPr>
-          <w:p>
-            <w:pPr>
-              <w:pStyle w:val="Compact"/>
-              <w:spacing w:before="40" w:after="40"/>
-              <w:jc w:val="left"/>
-            </w:pPr>
-            <w:r>
-              <w:rPr>
-                <w:rFonts w:ascii="Arial" w:hAnsi="Arial"/>
-                <w:sz w:val="20"/>
-              </w:rPr>
-              <w:t xml:space="preserve">88</w:t>
-            </w:r>
-          </w:p>
-        </w:tc>
-        <w:tc>
-          <w:tcPr>
-            <w:tcW w:type="dxa" w:w="2880"/>
-          </w:tcPr>
-          <w:p>
-            <w:pPr>
-              <w:pStyle w:val="Compact"/>
-              <w:spacing w:before="40" w:after="40"/>
-              <w:jc w:val="left"/>
-            </w:pPr>
-            <w:r>
-              <w:rPr>
-                <w:rFonts w:ascii="Arial" w:hAnsi="Arial"/>
-                <w:sz w:val="20"/>
-              </w:rPr>
-              <w:t xml:space="preserve">17</w:t>
-            </w:r>
-          </w:p>
-        </w:tc>
-      </w:tr>
-      <w:tr>
-        <w:tc>
-          <w:tcPr>
-            <w:tcW w:type="dxa" w:w="3456"/>
-          </w:tcPr>
-          <w:p>
-            <w:pPr>
-              <w:pStyle w:val="Compact"/>
-              <w:spacing w:before="40" w:after="40"/>
-              <w:jc w:val="left"/>
-            </w:pPr>
-            <w:r>
-              <w:rPr>
-                <w:bCs/>
-                <w:rFonts w:ascii="Arial" w:hAnsi="Arial"/>
-                <w:b/>
-                <w:sz w:val="20"/>
-              </w:rPr>
-              <w:t xml:space="preserve">Tax</w:t>
-            </w:r>
-          </w:p>
-        </w:tc>
-        <w:tc>
-          <w:tcPr>
-            <w:tcW w:type="dxa" w:w="3024"/>
-          </w:tcPr>
-          <w:p>
-            <w:pPr>
-              <w:pStyle w:val="Compact"/>
-              <w:spacing w:before="40" w:after="40"/>
-              <w:jc w:val="left"/>
-            </w:pPr>
-            <w:r>
-              <w:rPr>
-                <w:rFonts w:ascii="Arial" w:hAnsi="Arial"/>
-                <w:sz w:val="20"/>
-              </w:rPr>
-              <w:t xml:space="preserve">28</w:t>
-            </w:r>
-          </w:p>
-        </w:tc>
-        <w:tc>
-          <w:tcPr>
-            <w:tcW w:type="dxa" w:w="2880"/>
-          </w:tcPr>
-          <w:p>
-            <w:pPr>
-              <w:pStyle w:val="Compact"/>
-              <w:spacing w:before="40" w:after="40"/>
-              <w:jc w:val="left"/>
-            </w:pPr>
-            <w:r>
-              <w:rPr>
-                <w:rFonts w:ascii="Arial" w:hAnsi="Arial"/>
-                <w:sz w:val="20"/>
-              </w:rPr>
-              <w:t xml:space="preserve">15</w:t>
-            </w:r>
-          </w:p>
-        </w:tc>
-      </w:tr>
-      <w:tr>
-        <w:tc>
-          <w:tcPr>
-            <w:tcW w:type="dxa" w:w="3456"/>
-          </w:tcPr>
-          <w:p>
-            <w:pPr>
-              <w:pStyle w:val="Compact"/>
-              <w:spacing w:before="40" w:after="40"/>
-              <w:jc w:val="left"/>
-            </w:pPr>
-            <w:r>
-              <w:rPr>
-                <w:bCs/>
-                <w:rFonts w:ascii="Arial" w:hAnsi="Arial"/>
-                <w:b/>
-                <w:sz w:val="20"/>
-              </w:rPr>
-              <w:t xml:space="preserve">Other types</w:t>
-            </w:r>
-          </w:p>
-        </w:tc>
-        <w:tc>
-          <w:tcPr>
-            <w:tcW w:type="dxa" w:w="3024"/>
-          </w:tcPr>
-          <w:p>
-            <w:pPr>
-              <w:pStyle w:val="Compact"/>
-              <w:spacing w:before="40" w:after="40"/>
-              <w:jc w:val="left"/>
-            </w:pPr>
-            <w:r>
-              <w:rPr>
-                <w:rFonts w:ascii="Arial" w:hAnsi="Arial"/>
-                <w:sz w:val="20"/>
-              </w:rPr>
-              <w:t xml:space="preserve">42</w:t>
-            </w:r>
-          </w:p>
-        </w:tc>
-        <w:tc>
-          <w:tcPr>
-            <w:tcW w:type="dxa" w:w="2880"/>
-          </w:tcPr>
-          <w:p>
-            <w:pPr>
-              <w:pStyle w:val="Compact"/>
-              <w:spacing w:before="40" w:after="40"/>
-              <w:jc w:val="left"/>
-            </w:pPr>
-            <w:r>
-              <w:rPr>
-                <w:rFonts w:ascii="Arial" w:hAnsi="Arial"/>
-                <w:sz w:val="20"/>
-              </w:rPr>
-              <w:t xml:space="preserve">18</w:t>
-            </w:r>
-          </w:p>
-        </w:tc>
-      </w:tr>
-    </w:tbl>
-    <w:p>
-      <w:pPr>
-        <w:pStyle w:val="BodyText"/>
-      </w:pPr>
-      <w:r>
-        <w:t xml:space="preserve">The export of all active vendors lists 1,775. The 5 not in the detail export are flagged One-time use in Sage. The Sage vendor list report has 1,788: the 1,775 plus 13 inactive.</w:t>
-      </w:r>
-    </w:p>
-    <w:p>
-      <w:pPr>
-        <w:pStyle w:val="BodyText"/>
-      </w:pPr>
-      <w:r>
-        <w:t xml:space="preserve">27 Ramp vendors have no Sage vendor, for example KPMG LLP, Baker Botts LLP, Oracle America and Navan.</w:t>
-      </w:r>
-    </w:p>
-    <w:bookmarkEnd w:id="23"/>
-    <w:bookmarkStart w:id="26" w:name="load-plan"/>
-    <w:p>
-      <w:pPr>
-        <w:pStyle w:val="Heading1"/>
-      </w:pPr>
-      <w:r>
-        <w:t xml:space="preserve">Load plan</w:t>
-      </w:r>
-    </w:p>
-    <w:p>
-      <w:pPr>
-        <w:pStyle w:val="FirstParagraph"/>
-      </w:pPr>
-      <w:r>
-        <w:t xml:space="preserve">Agreed 2026-10-26: Ramp syncs first, then NetSuite is enriched with what Ramp does not push. Every active Sage vendor ends up in NetSuite.</w:t>
-      </w:r>
-    </w:p>
-    <w:p>
-      <w:pPr>
-        <w:numPr>
-          <w:ilvl w:val="0"/>
-          <w:numId w:val="1001"/>
-        </w:numPr>
-        <w:pStyle w:val="Compact"/>
-      </w:pPr>
-      <w:r>
-        <w:rPr>
-          <w:bCs/>
-          <w:b/>
-        </w:rPr>
-        <w:t xml:space="preserve">Ramp sync.</w:t>
-      </w:r>
-      <w:r>
-        <w:t xml:space="preserve"> </w:t>
-      </w:r>
-      <w:r>
-        <w:t xml:space="preserve">Ramp syncs its 578 vendors to NetSuite, including the 27 Ramp vendors not in Sage (added in Ramp from 2025-08 on, 23 with no spend yet).</w:t>
-      </w:r>
-    </w:p>
-    <w:p>
-      <w:pPr>
-        <w:numPr>
-          <w:ilvl w:val="0"/>
-          <w:numId w:val="1001"/>
-        </w:numPr>
-        <w:pStyle w:val="Compact"/>
-      </w:pPr>
-      <w:r>
-        <w:rPr>
-          <w:bCs/>
-          <w:b/>
-        </w:rPr>
-        <w:t xml:space="preserve">Sage vendors not in Ramp.</w:t>
-      </w:r>
-      <w:r>
-        <w:t xml:space="preserve"> </w:t>
-      </w:r>
-      <w:r>
-        <w:t xml:space="preserve">This load: the 1,219 active Sage vendors that are not in Ramp, mapped as above.</w:t>
-      </w:r>
-    </w:p>
-    <w:p>
-      <w:pPr>
-        <w:numPr>
-          <w:ilvl w:val="0"/>
-          <w:numId w:val="1001"/>
-        </w:numPr>
-        <w:pStyle w:val="Compact"/>
-      </w:pPr>
-      <w:r>
-        <w:rPr>
-          <w:bCs/>
-          <w:b/>
-        </w:rPr>
-        <w:t xml:space="preserve">Enrichment.</w:t>
-      </w:r>
-      <w:r>
-        <w:t xml:space="preserve"> </w:t>
-      </w:r>
-      <w:r>
-        <w:t xml:space="preserve">The 551 vendors in both systems get Sage values Ramp does not hold: Sage Vendor ID, Vendor Category, default expense account, 1099 flag, tax ID where Ramp has none. Ramp-created NetSuite vendors carry no Sage ID, so after the sync the enrichment file is matched to them by Ramp vendor name and Ramp Vendor ID, then re-keyed to the NetSuite internal ID before import.</w:t>
-      </w:r>
-    </w:p>
-    <w:p>
-      <w:pPr>
-        <w:numPr>
-          <w:ilvl w:val="0"/>
-          <w:numId w:val="1001"/>
-        </w:numPr>
-        <w:pStyle w:val="Compact"/>
-      </w:pPr>
-      <w:r>
-        <w:rPr>
-          <w:bCs/>
-          <w:b/>
-        </w:rPr>
-        <w:t xml:space="preserve">Bank details.</w:t>
-      </w:r>
-      <w:r>
-        <w:t xml:space="preserve"> </w:t>
-      </w:r>
-      <w:r>
-        <w:t xml:space="preserve">Ramp does not push bank details to NetSuite, so every vendor’s bank details are imported separately: Ramp’s where Ramp has them (Ramp is primary), else Sage’s.</w:t>
-      </w:r>
-    </w:p>
-    <w:bookmarkStart w:id="24" w:name="bank-details"/>
-    <w:p>
-      <w:pPr>
-        <w:pStyle w:val="Heading2"/>
-      </w:pPr>
-      <w:r>
-        <w:t xml:space="preserve">Bank details</w:t>
-      </w:r>
-    </w:p>
-    <w:tbl>
-      <w:tblPr>
-        <w:tblStyle w:val="Table"/>
-        <w:tblW w:type="dxa" w:w="9360"/>
-        <w:jc w:val="center"/>
-        <w:tblLook w:firstRow="1" w:lastRow="0" w:firstColumn="0" w:lastColumn="0" w:noHBand="0" w:noVBand="0" w:val="0020"/>
-        <w:tblBorders>
-          <w:top w:val="single" w:sz="4" w:space="0" w:color="BFC7D1"/>
-          <w:left w:val="single" w:sz="4" w:space="0" w:color="BFC7D1"/>
-          <w:bottom w:val="single" w:sz="4" w:space="0" w:color="BFC7D1"/>
-          <w:right w:val="single" w:sz="4" w:space="0" w:color="BFC7D1"/>
-          <w:insideH w:val="single" w:sz="4" w:space="0" w:color="BFC7D1"/>
-          <w:insideV w:val="single" w:sz="4" w:space="0" w:color="BFC7D1"/>
-        </w:tblBorders>
-        <w:tblLayout w:type="fixed"/>
-      </w:tblPr>
-      <w:tblGrid>
-        <w:gridCol w:w="4290"/>
-        <w:gridCol w:w="5070"/>
-      </w:tblGrid>
-      <w:tr>
-        <w:trPr>
-          <w:tblHeader w:val="true"/>
-        </w:trPr>
-        <w:tc>
-          <w:tcPr>
-            <w:tcW w:type="dxa" w:w="4290"/>
-            <w:shd w:val="clear" w:color="auto" w:fill="1F3B5C"/>
-          </w:tcPr>
-          <w:p>
-            <w:pPr>
-              <w:pStyle w:val="Compact"/>
-              <w:spacing w:before="40" w:after="40"/>
-            </w:pPr>
-          </w:p>
-        </w:tc>
-        <w:tc>
-          <w:tcPr>
-            <w:tcW w:type="dxa" w:w="5070"/>
-            <w:shd w:val="clear" w:color="auto" w:fill="1F3B5C"/>
-          </w:tcPr>
-          <w:p>
-            <w:pPr>
-              <w:pStyle w:val="Compact"/>
-              <w:spacing w:before="40" w:after="40"/>
-              <w:jc w:val="left"/>
-            </w:pPr>
-            <w:r>
-              <w:rPr>
-                <w:bCs/>
-                <w:rFonts w:ascii="Arial" w:hAnsi="Arial"/>
-                <w:b/>
-                <w:color w:val="FFFFFF"/>
-                <w:sz w:val="20"/>
-              </w:rPr>
-              <w:t xml:space="preserve">Vendors</w:t>
-            </w:r>
-          </w:p>
-        </w:tc>
-      </w:tr>
-      <w:tr>
-        <w:tc>
-          <w:tcPr>
-            <w:tcW w:type="dxa" w:w="4290"/>
-          </w:tcPr>
-          <w:p>
-            <w:pPr>
-              <w:pStyle w:val="Compact"/>
-              <w:spacing w:before="40" w:after="40"/>
-              <w:jc w:val="left"/>
-            </w:pPr>
-            <w:r>
-              <w:rPr>
-                <w:bCs/>
-                <w:rFonts w:ascii="Arial" w:hAnsi="Arial"/>
-                <w:b/>
-                <w:sz w:val="20"/>
-              </w:rPr>
-              <w:t xml:space="preserve">ACH details in Sage</w:t>
-            </w:r>
-          </w:p>
-        </w:tc>
-        <w:tc>
-          <w:tcPr>
-            <w:tcW w:type="dxa" w:w="5070"/>
-          </w:tcPr>
-          <w:p>
-            <w:pPr>
-              <w:pStyle w:val="Compact"/>
-              <w:spacing w:before="40" w:after="40"/>
-              <w:jc w:val="left"/>
-            </w:pPr>
-            <w:r>
-              <w:rPr>
-                <w:rFonts w:ascii="Arial" w:hAnsi="Arial"/>
-                <w:sz w:val="20"/>
-              </w:rPr>
-              <w:t xml:space="preserve">164</w:t>
-            </w:r>
-          </w:p>
-        </w:tc>
-      </w:tr>
-      <w:tr>
-        <w:tc>
-          <w:tcPr>
-            <w:tcW w:type="dxa" w:w="4290"/>
-          </w:tcPr>
-          <w:p>
-            <w:pPr>
-              <w:pStyle w:val="Compact"/>
-              <w:spacing w:before="40" w:after="40"/>
-              <w:jc w:val="left"/>
-            </w:pPr>
-            <w:r>
-              <w:rPr>
-                <w:bCs/>
-                <w:rFonts w:ascii="Arial" w:hAnsi="Arial"/>
-                <w:b/>
-                <w:sz w:val="20"/>
-              </w:rPr>
-              <w:t xml:space="preserve">ACH details in Ramp (vendors with a Sage ID)</w:t>
-            </w:r>
-          </w:p>
-        </w:tc>
-        <w:tc>
-          <w:tcPr>
-            <w:tcW w:type="dxa" w:w="5070"/>
-          </w:tcPr>
-          <w:p>
-            <w:pPr>
-              <w:pStyle w:val="Compact"/>
-              <w:spacing w:before="40" w:after="40"/>
-              <w:jc w:val="left"/>
-            </w:pPr>
-            <w:r>
-              <w:rPr>
-                <w:rFonts w:ascii="Arial" w:hAnsi="Arial"/>
-                <w:sz w:val="20"/>
-              </w:rPr>
-              <w:t xml:space="preserve">174</w:t>
-            </w:r>
-          </w:p>
-        </w:tc>
-      </w:tr>
-      <w:tr>
-        <w:tc>
-          <w:tcPr>
-            <w:tcW w:type="dxa" w:w="4290"/>
-          </w:tcPr>
-          <w:p>
-            <w:pPr>
-              <w:pStyle w:val="Compact"/>
-              <w:spacing w:before="40" w:after="40"/>
-              <w:jc w:val="left"/>
-            </w:pPr>
-            <w:r>
-              <w:rPr>
-                <w:bCs/>
-                <w:rFonts w:ascii="Arial" w:hAnsi="Arial"/>
-                <w:b/>
-                <w:sz w:val="20"/>
-              </w:rPr>
-              <w:t xml:space="preserve">In both</w:t>
-            </w:r>
-          </w:p>
-        </w:tc>
-        <w:tc>
-          <w:tcPr>
-            <w:tcW w:type="dxa" w:w="5070"/>
-          </w:tcPr>
-          <w:p>
-            <w:pPr>
-              <w:pStyle w:val="Compact"/>
-              <w:spacing w:before="40" w:after="40"/>
-              <w:jc w:val="left"/>
-            </w:pPr>
-            <w:r>
-              <w:rPr>
-                <w:rFonts w:ascii="Arial" w:hAnsi="Arial"/>
-                <w:sz w:val="20"/>
-              </w:rPr>
-              <w:t xml:space="preserve">70 (last 4 digits agree on 65, differ on 5)</w:t>
-            </w:r>
-          </w:p>
-        </w:tc>
-      </w:tr>
-      <w:tr>
-        <w:tc>
-          <w:tcPr>
-            <w:tcW w:type="dxa" w:w="4290"/>
-          </w:tcPr>
-          <w:p>
-            <w:pPr>
-              <w:pStyle w:val="Compact"/>
-              <w:spacing w:before="40" w:after="40"/>
-              <w:jc w:val="left"/>
-            </w:pPr>
-            <w:r>
-              <w:rPr>
-                <w:bCs/>
-                <w:rFonts w:ascii="Arial" w:hAnsi="Arial"/>
-                <w:b/>
-                <w:sz w:val="20"/>
-              </w:rPr>
-              <w:t xml:space="preserve">Sage only</w:t>
-            </w:r>
-          </w:p>
-        </w:tc>
-        <w:tc>
-          <w:tcPr>
-            <w:tcW w:type="dxa" w:w="5070"/>
-          </w:tcPr>
-          <w:p>
-            <w:pPr>
-              <w:pStyle w:val="Compact"/>
-              <w:spacing w:before="40" w:after="40"/>
-              <w:jc w:val="left"/>
-            </w:pPr>
-            <w:r>
-              <w:rPr>
-                <w:rFonts w:ascii="Arial" w:hAnsi="Arial"/>
-                <w:sz w:val="20"/>
-              </w:rPr>
-              <w:t xml:space="preserve">94 (13 in Ramp without bank details, 81 not in Ramp)</w:t>
-            </w:r>
-          </w:p>
-        </w:tc>
-      </w:tr>
-      <w:tr>
-        <w:tc>
-          <w:tcPr>
-            <w:tcW w:type="dxa" w:w="4290"/>
-          </w:tcPr>
-          <w:p>
-            <w:pPr>
-              <w:pStyle w:val="Compact"/>
-              <w:spacing w:before="40" w:after="40"/>
-              <w:jc w:val="left"/>
-            </w:pPr>
-            <w:r>
-              <w:rPr>
-                <w:bCs/>
-                <w:rFonts w:ascii="Arial" w:hAnsi="Arial"/>
-                <w:b/>
-                <w:sz w:val="20"/>
-              </w:rPr>
-              <w:t xml:space="preserve">Ramp only</w:t>
-            </w:r>
-          </w:p>
-        </w:tc>
-        <w:tc>
-          <w:tcPr>
-            <w:tcW w:type="dxa" w:w="5070"/>
-          </w:tcPr>
-          <w:p>
-            <w:pPr>
-              <w:pStyle w:val="Compact"/>
-              <w:spacing w:before="40" w:after="40"/>
-              <w:jc w:val="left"/>
-            </w:pPr>
-            <w:r>
-              <w:rPr>
-                <w:rFonts w:ascii="Arial" w:hAnsi="Arial"/>
-                <w:sz w:val="20"/>
-              </w:rPr>
-              <w:t xml:space="preserve">104</w:t>
-            </w:r>
-          </w:p>
-        </w:tc>
-      </w:tr>
-    </w:tbl>
-    <w:p>
-      <w:pPr>
-        <w:pStyle w:val="BodyText"/>
-      </w:pPr>
-      <w:r>
-        <w:t xml:space="preserve">Ramp is primary where both exist, including the 5 that differ. The vendor template has no bank fields, so bank details need their own NetSuite import (vendor bank details record): 268 vendors, Ramp’s details for 174 and Sage’s for 94.</w:t>
-      </w:r>
-    </w:p>
-    <w:bookmarkEnd w:id="24"/>
-    <w:bookmarkStart w:id="25" w:name="vendor-types-against-ramp"/>
-    <w:p>
-      <w:pPr>
-        <w:pStyle w:val="Heading2"/>
-      </w:pPr>
-      <w:r>
-        <w:t xml:space="preserve">Vendor types against Ramp</w:t>
-      </w:r>
-    </w:p>
-    <w:tbl>
-      <w:tblPr>
-        <w:tblStyle w:val="Table"/>
-        <w:tblW w:type="dxa" w:w="9360"/>
-        <w:jc w:val="center"/>
-        <w:tblLook w:firstRow="1" w:lastRow="0" w:firstColumn="0" w:lastColumn="0" w:noHBand="0" w:noVBand="0" w:val="0020"/>
-        <w:tblBorders>
-          <w:top w:val="single" w:sz="4" w:space="0" w:color="BFC7D1"/>
-          <w:left w:val="single" w:sz="4" w:space="0" w:color="BFC7D1"/>
-          <w:bottom w:val="single" w:sz="4" w:space="0" w:color="BFC7D1"/>
-          <w:right w:val="single" w:sz="4" w:space="0" w:color="BFC7D1"/>
-          <w:insideH w:val="single" w:sz="4" w:space="0" w:color="BFC7D1"/>
-          <w:insideV w:val="single" w:sz="4" w:space="0" w:color="BFC7D1"/>
-        </w:tblBorders>
-        <w:tblLayout w:type="fixed"/>
-      </w:tblPr>
-      <w:tblGrid>
-        <w:gridCol w:w="1487"/>
-        <w:gridCol w:w="1301"/>
-        <w:gridCol w:w="991"/>
-        <w:gridCol w:w="5578"/>
-      </w:tblGrid>
-      <w:tr>
-        <w:trPr>
-          <w:tblHeader w:val="true"/>
-        </w:trPr>
-        <w:tc>
-          <w:tcPr>
-            <w:tcW w:type="dxa" w:w="1487"/>
-            <w:shd w:val="clear" w:color="auto" w:fill="1F3B5C"/>
-          </w:tcPr>
-          <w:p>
-            <w:pPr>
-              <w:pStyle w:val="Compact"/>
-              <w:spacing w:before="40" w:after="40"/>
-              <w:jc w:val="left"/>
-            </w:pPr>
-            <w:r>
-              <w:rPr>
-                <w:bCs/>
-                <w:rFonts w:ascii="Arial" w:hAnsi="Arial"/>
-                <w:b/>
-                <w:color w:val="FFFFFF"/>
-                <w:sz w:val="20"/>
-              </w:rPr>
-              <w:t xml:space="preserve">Sage vendor type</w:t>
-            </w:r>
-          </w:p>
-        </w:tc>
-        <w:tc>
-          <w:tcPr>
-            <w:tcW w:type="dxa" w:w="1301"/>
-            <w:shd w:val="clear" w:color="auto" w:fill="1F3B5C"/>
-          </w:tcPr>
-          <w:p>
-            <w:pPr>
-              <w:pStyle w:val="Compact"/>
-              <w:spacing w:before="40" w:after="40"/>
-              <w:jc w:val="left"/>
-            </w:pPr>
-            <w:r>
-              <w:rPr>
-                <w:bCs/>
-                <w:rFonts w:ascii="Arial" w:hAnsi="Arial"/>
-                <w:b/>
-                <w:color w:val="FFFFFF"/>
-                <w:sz w:val="20"/>
-              </w:rPr>
-              <w:t xml:space="preserve">Vendors</w:t>
-            </w:r>
-          </w:p>
-        </w:tc>
-        <w:tc>
-          <w:tcPr>
-            <w:tcW w:type="dxa" w:w="991"/>
-            <w:shd w:val="clear" w:color="auto" w:fill="1F3B5C"/>
-          </w:tcPr>
-          <w:p>
-            <w:pPr>
-              <w:pStyle w:val="Compact"/>
-              <w:spacing w:before="40" w:after="40"/>
-              <w:jc w:val="left"/>
-            </w:pPr>
-            <w:r>
-              <w:rPr>
-                <w:bCs/>
-                <w:rFonts w:ascii="Arial" w:hAnsi="Arial"/>
-                <w:b/>
-                <w:color w:val="FFFFFF"/>
-                <w:sz w:val="20"/>
-              </w:rPr>
-              <w:t xml:space="preserve">In Ramp</w:t>
-            </w:r>
-          </w:p>
-        </w:tc>
-        <w:tc>
-          <w:tcPr>
-            <w:tcW w:type="dxa" w:w="5578"/>
-            <w:shd w:val="clear" w:color="auto" w:fill="1F3B5C"/>
-          </w:tcPr>
-          <w:p>
-            <w:pPr>
-              <w:pStyle w:val="Compact"/>
-              <w:spacing w:before="40" w:after="40"/>
-              <w:jc w:val="left"/>
-            </w:pPr>
-            <w:r>
-              <w:rPr>
-                <w:bCs/>
-                <w:rFonts w:ascii="Arial" w:hAnsi="Arial"/>
-                <w:b/>
-                <w:color w:val="FFFFFF"/>
-                <w:sz w:val="20"/>
-              </w:rPr>
-              <w:t xml:space="preserve">Note</w:t>
-            </w:r>
-          </w:p>
-        </w:tc>
-      </w:tr>
-      <w:tr>
-        <w:tc>
-          <w:tcPr>
-            <w:tcW w:type="dxa" w:w="1487"/>
-          </w:tcPr>
-          <w:p>
-            <w:pPr>
-              <w:pStyle w:val="Compact"/>
-              <w:spacing w:before="40" w:after="40"/>
-              <w:jc w:val="left"/>
-            </w:pPr>
-            <w:r>
-              <w:rPr>
-                <w:bCs/>
-                <w:rFonts w:ascii="Arial" w:hAnsi="Arial"/>
-                <w:b/>
-                <w:sz w:val="20"/>
-              </w:rPr>
-              <w:t xml:space="preserve">Credit Cards</w:t>
-            </w:r>
-          </w:p>
-        </w:tc>
-        <w:tc>
-          <w:tcPr>
-            <w:tcW w:type="dxa" w:w="1301"/>
-          </w:tcPr>
-          <w:p>
-            <w:pPr>
-              <w:pStyle w:val="Compact"/>
-              <w:spacing w:before="40" w:after="40"/>
-              <w:jc w:val="left"/>
-            </w:pPr>
-            <w:r>
-              <w:rPr>
-                <w:rFonts w:ascii="Arial" w:hAnsi="Arial"/>
-                <w:sz w:val="20"/>
-              </w:rPr>
-              <w:t xml:space="preserve">427</w:t>
-            </w:r>
-          </w:p>
-        </w:tc>
-        <w:tc>
-          <w:tcPr>
-            <w:tcW w:type="dxa" w:w="991"/>
-          </w:tcPr>
-          <w:p>
-            <w:pPr>
-              <w:pStyle w:val="Compact"/>
-              <w:spacing w:before="40" w:after="40"/>
-              <w:jc w:val="left"/>
-            </w:pPr>
-            <w:r>
-              <w:rPr>
-                <w:rFonts w:ascii="Arial" w:hAnsi="Arial"/>
-                <w:sz w:val="20"/>
-              </w:rPr>
-              <w:t xml:space="preserve">123</w:t>
-            </w:r>
-          </w:p>
-        </w:tc>
-        <w:tc>
-          <w:tcPr>
-            <w:tcW w:type="dxa" w:w="5578"/>
-          </w:tcPr>
-          <w:p>
-            <w:pPr>
-              <w:pStyle w:val="Compact"/>
-              <w:spacing w:before="40" w:after="40"/>
-              <w:jc w:val="left"/>
-            </w:pPr>
-            <w:r>
-              <w:rPr>
-                <w:rFonts w:ascii="Arial" w:hAnsi="Arial"/>
-                <w:sz w:val="20"/>
-              </w:rPr>
-              <w:t xml:space="preserve">“</w:t>
-            </w:r>
-            <w:r>
-              <w:rPr>
-                <w:rFonts w:ascii="Arial" w:hAnsi="Arial"/>
-                <w:sz w:val="20"/>
-              </w:rPr>
-              <w:t xml:space="preserve">Never billed</w:t>
-            </w:r>
-            <w:r>
-              <w:rPr>
-                <w:rFonts w:ascii="Arial" w:hAnsi="Arial"/>
-                <w:sz w:val="20"/>
-              </w:rPr>
-              <w:t xml:space="preserve">”</w:t>
-            </w:r>
-            <w:r>
-              <w:rPr>
-                <w:rFonts w:ascii="Arial" w:hAnsi="Arial"/>
-                <w:sz w:val="20"/>
-              </w:rPr>
-              <w:t xml:space="preserve"> </w:t>
-            </w:r>
-            <w:r>
-              <w:rPr>
-                <w:rFonts w:ascii="Arial" w:hAnsi="Arial"/>
-                <w:sz w:val="20"/>
-              </w:rPr>
-              <w:t xml:space="preserve">means no AP bill in Sage: card purchases are booked from the card feed, not as bills. 122 of the 123 in Ramp have Ramp spend. The other 304 are card merchants from before Ramp, plus the card accounts themselves (for example Mastercard - 3584, CHASE CC - ALL CREDIT CARDS)</w:t>
-            </w:r>
-          </w:p>
-        </w:tc>
-      </w:tr>
-      <w:tr>
-        <w:tc>
-          <w:tcPr>
-            <w:tcW w:type="dxa" w:w="1487"/>
-          </w:tcPr>
-          <w:p>
-            <w:pPr>
-              <w:pStyle w:val="Compact"/>
-              <w:spacing w:before="40" w:after="40"/>
-              <w:jc w:val="left"/>
-            </w:pPr>
-            <w:r>
-              <w:rPr>
-                <w:bCs/>
-                <w:rFonts w:ascii="Arial" w:hAnsi="Arial"/>
-                <w:b/>
-                <w:sz w:val="20"/>
-              </w:rPr>
-              <w:t xml:space="preserve">MinIO employee</w:t>
-            </w:r>
-          </w:p>
-        </w:tc>
-        <w:tc>
-          <w:tcPr>
-            <w:tcW w:type="dxa" w:w="1301"/>
-          </w:tcPr>
-          <w:p>
-            <w:pPr>
-              <w:pStyle w:val="Compact"/>
-              <w:spacing w:before="40" w:after="40"/>
-              <w:jc w:val="left"/>
-            </w:pPr>
-            <w:r>
-              <w:rPr>
-                <w:rFonts w:ascii="Arial" w:hAnsi="Arial"/>
-                <w:sz w:val="20"/>
-              </w:rPr>
-              <w:t xml:space="preserve">136</w:t>
-            </w:r>
-          </w:p>
-        </w:tc>
-        <w:tc>
-          <w:tcPr>
-            <w:tcW w:type="dxa" w:w="991"/>
-          </w:tcPr>
-          <w:p>
-            <w:pPr>
-              <w:pStyle w:val="Compact"/>
-              <w:spacing w:before="40" w:after="40"/>
-              <w:jc w:val="left"/>
-            </w:pPr>
-            <w:r>
-              <w:rPr>
-                <w:rFonts w:ascii="Arial" w:hAnsi="Arial"/>
-                <w:sz w:val="20"/>
-              </w:rPr>
-              <w:t xml:space="preserve">1</w:t>
-            </w:r>
-          </w:p>
-        </w:tc>
-        <w:tc>
-          <w:tcPr>
-            <w:tcW w:type="dxa" w:w="5578"/>
-          </w:tcPr>
-          <w:p>
-            <w:pPr>
-              <w:pStyle w:val="Compact"/>
-              <w:spacing w:before="40" w:after="40"/>
-              <w:jc w:val="left"/>
-            </w:pPr>
-            <w:r>
-              <w:rPr>
-                <w:rFonts w:ascii="Arial" w:hAnsi="Arial"/>
-                <w:sz w:val="20"/>
-              </w:rPr>
-              <w:t xml:space="preserve">74 were reimbursed through Sage bills. Ramp reimbursements sync to NetSuite as vendor bills with the employee as the vendor (or one default reimbursement vendor), so employee vendor records are the right home</w:t>
-            </w:r>
-          </w:p>
-        </w:tc>
-      </w:tr>
-      <w:tr>
-        <w:tc>
-          <w:tcPr>
-            <w:tcW w:type="dxa" w:w="1487"/>
-          </w:tcPr>
-          <w:p>
-            <w:pPr>
-              <w:pStyle w:val="Compact"/>
-              <w:spacing w:before="40" w:after="40"/>
-              <w:jc w:val="left"/>
-            </w:pPr>
-            <w:r>
-              <w:rPr>
-                <w:bCs/>
-                <w:rFonts w:ascii="Arial" w:hAnsi="Arial"/>
-                <w:b/>
-                <w:sz w:val="20"/>
-              </w:rPr>
-              <w:t xml:space="preserve">AR reseller</w:t>
-            </w:r>
-          </w:p>
-        </w:tc>
-        <w:tc>
-          <w:tcPr>
-            <w:tcW w:type="dxa" w:w="1301"/>
-          </w:tcPr>
-          <w:p>
-            <w:pPr>
-              <w:pStyle w:val="Compact"/>
-              <w:spacing w:before="40" w:after="40"/>
-              <w:jc w:val="left"/>
-            </w:pPr>
-            <w:r>
-              <w:rPr>
-                <w:rFonts w:ascii="Arial" w:hAnsi="Arial"/>
-                <w:sz w:val="20"/>
-              </w:rPr>
-              <w:t xml:space="preserve">127</w:t>
-            </w:r>
-          </w:p>
-        </w:tc>
-        <w:tc>
-          <w:tcPr>
-            <w:tcW w:type="dxa" w:w="991"/>
-          </w:tcPr>
-          <w:p>
-            <w:pPr>
-              <w:pStyle w:val="Compact"/>
-              <w:spacing w:before="40" w:after="40"/>
-              <w:jc w:val="left"/>
-            </w:pPr>
-            <w:r>
-              <w:rPr>
-                <w:rFonts w:ascii="Arial" w:hAnsi="Arial"/>
-                <w:sz w:val="20"/>
-              </w:rPr>
-              <w:t xml:space="preserve">9</w:t>
-            </w:r>
-          </w:p>
-        </w:tc>
-        <w:tc>
-          <w:tcPr>
-            <w:tcW w:type="dxa" w:w="5578"/>
-          </w:tcPr>
-          <w:p>
-            <w:pPr>
-              <w:pStyle w:val="Compact"/>
-              <w:spacing w:before="40" w:after="40"/>
-              <w:jc w:val="left"/>
-            </w:pPr>
-            <w:r>
-              <w:rPr>
-                <w:rFonts w:ascii="Arial" w:hAnsi="Arial"/>
-                <w:sz w:val="20"/>
-              </w:rPr>
-              <w:t xml:space="preserve">2 billed in Sage</w:t>
-            </w:r>
-          </w:p>
-        </w:tc>
-      </w:tr>
-    </w:tbl>
-    <w:bookmarkEnd w:id="25"/>
-    <w:bookmarkEnd w:id="26"/>
-    <w:bookmarkStart w:id="27" w:name="open-questions"/>
-    <w:p>
-      <w:pPr>
-        <w:pStyle w:val="Heading1"/>
-      </w:pPr>
-      <w:r>
-        <w:t xml:space="preserve">Open questions</w:t>
-      </w:r>
-    </w:p>
-    <w:p>
-      <w:pPr>
-        <w:numPr>
-          <w:ilvl w:val="0"/>
-          <w:numId w:val="1002"/>
-        </w:numPr>
-        <w:pStyle w:val="Compact"/>
-      </w:pPr>
-      <w:r>
-        <w:rPr>
-          <w:bCs/>
-          <w:b/>
-        </w:rPr>
-        <w:t xml:space="preserve">Subsidiary for INR and SGD vendors.</w:t>
-      </w:r>
-      <w:r>
-        <w:t xml:space="preserve"> </w:t>
-      </w:r>
-      <w:r>
-        <w:t xml:space="preserve">None of these has activity in Ramp or bills in Sage. The INR vendors look like MinIO Pvt. Ltd. vendors (India tax, the India office, Indian accountants): V-01301 TDS Tax Payable, V-01311 Universal Actuaries and Benefit Consultants, V-01352 and V-01353 Zoho Corporation Private Limited, V-01354 91 Springboard Business Hub Private Limited, V-01380 Resurgent India Limited, V-01381 National Securities Depository Limited, V-01412 S P Nagarajan, V-01459 Vishnu Daya &amp; Co LLP. SGD: V-00628 Cloud Expo Asia Pte. Ltd. Load them to MinIO Pvt. Ltd. and MinIO Singapore Pte. Ltd., or to MinIO, Inc.? Several INR vendors have United States as their Sage country.</w:t>
-      </w:r>
-    </w:p>
-    <w:p>
-      <w:pPr>
-        <w:numPr>
-          <w:ilvl w:val="0"/>
-          <w:numId w:val="1002"/>
-        </w:numPr>
-        <w:pStyle w:val="Compact"/>
-      </w:pPr>
-      <w:r>
-        <w:rPr>
-          <w:bCs/>
-          <w:b/>
-        </w:rPr>
-        <w:t xml:space="preserve">Bank details import.</w:t>
-      </w:r>
-      <w:r>
-        <w:t xml:space="preserve"> </w:t>
-      </w:r>
-      <w:r>
-        <w:t xml:space="preserve">SOA to provide the template for vendor bank details.</w:t>
-      </w:r>
-    </w:p>
-    <w:p>
-      <w:pPr>
-        <w:numPr>
-          <w:ilvl w:val="0"/>
-          <w:numId w:val="1002"/>
-        </w:numPr>
-        <w:pStyle w:val="Compact"/>
-      </w:pPr>
-      <w:r>
-        <w:rPr>
-          <w:bCs/>
-          <w:b/>
-        </w:rPr>
-        <w:t xml:space="preserve">Enrichment matching.</w:t>
-      </w:r>
-      <w:r>
-        <w:t xml:space="preserve"> </w:t>
-      </w:r>
-      <w:r>
-        <w:t xml:space="preserve">After the Ramp sync, SOA to export NetSuite vendors (internal ID, name) so the enrichment and bank files can be keyed to the Ramp-created records. Can Ramp’s External ID field carry the Sage vendor ID into NetSuite, which would make the match exact?</w:t>
-      </w:r>
-    </w:p>
-    <w:bookmarkEnd w:id="27"/>
     <w:sectPr>
       <w:pgSz w:w="12240" w:h="15840"/>
       <w:pgMar w:left="1440" w:right="1440" w:top="1440" w:bottom="1440"/>
@@ -4257,153 +2304,8 @@
       </w:pPr>
     </w:lvl>
   </w:abstractNum>
-  <w:abstractNum w:abstractNumId="99411">
-    <w:nsid w:val="A99411"/>
-    <w:multiLevelType w:val="multilevel"/>
-    <w:lvl w:ilvl="0">
-      <w:start w:val="1"/>
-      <w:numFmt w:val="decimal"/>
-      <w:lvlText w:val="%1."/>
-      <w:lvlJc w:val="left"/>
-      <w:pPr>
-        <w:ind w:left="720" w:hanging="480"/>
-      </w:pPr>
-    </w:lvl>
-    <w:lvl w:ilvl="1">
-      <w:start w:val="1"/>
-      <w:numFmt w:val="decimal"/>
-      <w:lvlText w:val="%2."/>
-      <w:lvlJc w:val="left"/>
-      <w:pPr>
-        <w:ind w:left="1440" w:hanging="480"/>
-      </w:pPr>
-    </w:lvl>
-    <w:lvl w:ilvl="2">
-      <w:start w:val="1"/>
-      <w:numFmt w:val="decimal"/>
-      <w:lvlText w:val="%3."/>
-      <w:lvlJc w:val="left"/>
-      <w:pPr>
-        <w:ind w:left="2160" w:hanging="480"/>
-      </w:pPr>
-    </w:lvl>
-    <w:lvl w:ilvl="3">
-      <w:start w:val="1"/>
-      <w:numFmt w:val="decimal"/>
-      <w:lvlText w:val="%4."/>
-      <w:lvlJc w:val="left"/>
-      <w:pPr>
-        <w:ind w:left="2880" w:hanging="480"/>
-      </w:pPr>
-    </w:lvl>
-    <w:lvl w:ilvl="4">
-      <w:start w:val="1"/>
-      <w:numFmt w:val="decimal"/>
-      <w:lvlText w:val="%5."/>
-      <w:lvlJc w:val="left"/>
-      <w:pPr>
-        <w:ind w:left="3600" w:hanging="480"/>
-      </w:pPr>
-    </w:lvl>
-    <w:lvl w:ilvl="5">
-      <w:start w:val="1"/>
-      <w:numFmt w:val="decimal"/>
-      <w:lvlText w:val="%6."/>
-      <w:lvlJc w:val="left"/>
-      <w:pPr>
-        <w:ind w:left="4320" w:hanging="480"/>
-      </w:pPr>
-    </w:lvl>
-    <w:lvl w:ilvl="6">
-      <w:start w:val="1"/>
-      <w:numFmt w:val="decimal"/>
-      <w:lvlText w:val="%7."/>
-      <w:lvlJc w:val="left"/>
-      <w:pPr>
-        <w:ind w:left="5040" w:hanging="480"/>
-      </w:pPr>
-    </w:lvl>
-    <w:lvl w:ilvl="7">
-      <w:start w:val="1"/>
-      <w:numFmt w:val="decimal"/>
-      <w:lvlText w:val="%8."/>
-      <w:lvlJc w:val="left"/>
-      <w:pPr>
-        <w:ind w:left="5760" w:hanging="480"/>
-      </w:pPr>
-    </w:lvl>
-    <w:lvl w:ilvl="8">
-      <w:start w:val="1"/>
-      <w:numFmt w:val="decimal"/>
-      <w:lvlText w:val="%9."/>
-      <w:lvlJc w:val="left"/>
-      <w:pPr>
-        <w:ind w:left="6480" w:hanging="480"/>
-      </w:pPr>
-    </w:lvl>
-  </w:abstractNum>
   <w:num w:numId="1000">
     <w:abstractNumId w:val="990"/>
-  </w:num>
-  <w:num w:numId="1001">
-    <w:abstractNumId w:val="99411"/>
-    <w:lvlOverride w:ilvl="0">
-      <w:startOverride w:val="1"/>
-    </w:lvlOverride>
-    <w:lvlOverride w:ilvl="1">
-      <w:startOverride w:val="1"/>
-    </w:lvlOverride>
-    <w:lvlOverride w:ilvl="2">
-      <w:startOverride w:val="1"/>
-    </w:lvlOverride>
-    <w:lvlOverride w:ilvl="3">
-      <w:startOverride w:val="1"/>
-    </w:lvlOverride>
-    <w:lvlOverride w:ilvl="4">
-      <w:startOverride w:val="1"/>
-    </w:lvlOverride>
-    <w:lvlOverride w:ilvl="5">
-      <w:startOverride w:val="1"/>
-    </w:lvlOverride>
-    <w:lvlOverride w:ilvl="6">
-      <w:startOverride w:val="1"/>
-    </w:lvlOverride>
-    <w:lvlOverride w:ilvl="7">
-      <w:startOverride w:val="1"/>
-    </w:lvlOverride>
-    <w:lvlOverride w:ilvl="8">
-      <w:startOverride w:val="1"/>
-    </w:lvlOverride>
-  </w:num>
-  <w:num w:numId="1002">
-    <w:abstractNumId w:val="99411"/>
-    <w:lvlOverride w:ilvl="0">
-      <w:startOverride w:val="1"/>
-    </w:lvlOverride>
-    <w:lvlOverride w:ilvl="1">
-      <w:startOverride w:val="1"/>
-    </w:lvlOverride>
-    <w:lvlOverride w:ilvl="2">
-      <w:startOverride w:val="1"/>
-    </w:lvlOverride>
-    <w:lvlOverride w:ilvl="3">
-      <w:startOverride w:val="1"/>
-    </w:lvlOverride>
-    <w:lvlOverride w:ilvl="4">
-      <w:startOverride w:val="1"/>
-    </w:lvlOverride>
-    <w:lvlOverride w:ilvl="5">
-      <w:startOverride w:val="1"/>
-    </w:lvlOverride>
-    <w:lvlOverride w:ilvl="6">
-      <w:startOverride w:val="1"/>
-    </w:lvlOverride>
-    <w:lvlOverride w:ilvl="7">
-      <w:startOverride w:val="1"/>
-    </w:lvlOverride>
-    <w:lvlOverride w:ilvl="8">
-      <w:startOverride w:val="1"/>
-    </w:lvlOverride>
   </w:num>
 </w:numbering>
 </file>

</xml_diff>